<commit_message>
refactor: Remove legacy batch and command scripts for package entry and yearbook automation; update main scripts to log completed tasks in Excel format.
</commit_message>
<xml_diff>
--- a/README.docx
+++ b/README.docx
@@ -1,10 +1,10 @@
 
 <file path=word/document.xml><?xml version="1.0" encoding="utf-8"?>
-<w:document xmlns:ve="http://schemas.openxmlformats.org/markup-compatibility/2006" xmlns:o="urn:schemas-microsoft-com:office:office" xmlns:r="http://schemas.openxmlformats.org/officeDocument/2006/relationships" xmlns:m="http://schemas.openxmlformats.org/officeDocument/2006/math" xmlns:v="urn:schemas-microsoft-com:vml" xmlns:wp="http://schemas.openxmlformats.org/drawingml/2006/wordprocessingDrawing" xmlns:w10="urn:schemas-microsoft-com:office:word" xmlns:w="http://schemas.openxmlformats.org/wordprocessingml/2006/main" xmlns:wne="http://schemas.microsoft.com/office/word/2006/wordml">
+<w:document xmlns:wpc="http://schemas.microsoft.com/office/word/2010/wordprocessingCanvas" xmlns:cx="http://schemas.microsoft.com/office/drawing/2014/chartex" xmlns:cx1="http://schemas.microsoft.com/office/drawing/2015/9/8/chartex" xmlns:cx2="http://schemas.microsoft.com/office/drawing/2015/10/21/chartex" xmlns:cx3="http://schemas.microsoft.com/office/drawing/2016/5/9/chartex" xmlns:cx4="http://schemas.microsoft.com/office/drawing/2016/5/10/chartex" xmlns:cx5="http://schemas.microsoft.com/office/drawing/2016/5/11/chartex" xmlns:cx6="http://schemas.microsoft.com/office/drawing/2016/5/12/chartex" xmlns:cx7="http://schemas.microsoft.com/office/drawing/2016/5/13/chartex" xmlns:cx8="http://schemas.microsoft.com/office/drawing/2016/5/14/chartex" xmlns:mc="http://schemas.openxmlformats.org/markup-compatibility/2006" xmlns:aink="http://schemas.microsoft.com/office/drawing/2016/ink" xmlns:am3d="http://schemas.microsoft.com/office/drawing/2017/model3d" xmlns:o="urn:schemas-microsoft-com:office:office" xmlns:oel="http://schemas.microsoft.com/office/2019/extlst" xmlns:r="http://schemas.openxmlformats.org/officeDocument/2006/relationships" xmlns:m="http://schemas.openxmlformats.org/officeDocument/2006/math" xmlns:v="urn:schemas-microsoft-com:vml" xmlns:wp14="http://schemas.microsoft.com/office/word/2010/wordprocessingDrawing" xmlns:wp="http://schemas.openxmlformats.org/drawingml/2006/wordprocessingDrawing" xmlns:w10="urn:schemas-microsoft-com:office:word" xmlns:w="http://schemas.openxmlformats.org/wordprocessingml/2006/main" xmlns:w14="http://schemas.microsoft.com/office/word/2010/wordml" xmlns:w15="http://schemas.microsoft.com/office/word/2012/wordml" xmlns:w16cex="http://schemas.microsoft.com/office/word/2018/wordml/cex" xmlns:w16cid="http://schemas.microsoft.com/office/word/2016/wordml/cid" xmlns:w16="http://schemas.microsoft.com/office/word/2018/wordml" xmlns:w16du="http://schemas.microsoft.com/office/word/2023/wordml/word16du" xmlns:w16sdtdh="http://schemas.microsoft.com/office/word/2020/wordml/sdtdatahash" xmlns:w16sdtfl="http://schemas.microsoft.com/office/word/2024/wordml/sdtformatlock" xmlns:w16se="http://schemas.microsoft.com/office/word/2015/wordml/symex" xmlns:wpg="http://schemas.microsoft.com/office/word/2010/wordprocessingGroup" xmlns:wpi="http://schemas.microsoft.com/office/word/2010/wordprocessingInk" xmlns:wne="http://schemas.microsoft.com/office/word/2006/wordml" xmlns:wps="http://schemas.microsoft.com/office/word/2010/wordprocessingShape" mc:Ignorable="w14 w15 w16se w16cid w16 w16cex w16sdtdh w16sdtfl w16du wp14">
   <w:body>
     <w:p>
       <w:pPr>
-        <w:spacing w:after="141" w:line="240" w:lineRule="auto"/>
+        <w:spacing w:after="240" w:line="240" w:lineRule="auto"/>
         <w:outlineLvl w:val="0"/>
         <w:rPr>
           <w:rFonts w:ascii="Segoe UI" w:eastAsia="Times New Roman" w:hAnsi="Segoe UI" w:cs="Segoe UI"/>
@@ -24,54 +24,133 @@
           <w:sz w:val="48"/>
           <w:szCs w:val="48"/>
         </w:rPr>
-        <w:t xml:space="preserve">School Days </w:t>
-      </w:r>
-      <w:proofErr w:type="gramStart"/>
+        <w:t>School Days Automation</w:t>
+      </w:r>
+    </w:p>
+    <w:p>
+      <w:pPr>
+        <w:spacing w:after="240" w:line="240" w:lineRule="auto"/>
+        <w:rPr>
+          <w:rFonts w:ascii="Segoe UI" w:eastAsia="Times New Roman" w:hAnsi="Segoe UI" w:cs="Segoe UI"/>
+          <w:sz w:val="21"/>
+          <w:szCs w:val="21"/>
+        </w:rPr>
+      </w:pPr>
+      <w:r>
+        <w:rPr>
+          <w:rFonts w:ascii="Segoe UI" w:eastAsia="Times New Roman" w:hAnsi="Segoe UI" w:cs="Segoe UI"/>
+          <w:sz w:val="21"/>
+          <w:szCs w:val="21"/>
+        </w:rPr>
+        <w:t>Two automations live here:</w:t>
+      </w:r>
+    </w:p>
+    <w:p>
+      <w:pPr>
+        <w:numPr>
+          <w:ilvl w:val="0"/>
+          <w:numId w:val="4"/>
+        </w:numPr>
+        <w:spacing w:before="100" w:beforeAutospacing="1" w:after="100" w:afterAutospacing="1" w:line="240" w:lineRule="auto"/>
+        <w:rPr>
+          <w:rFonts w:ascii="Segoe UI" w:eastAsia="Times New Roman" w:hAnsi="Segoe UI" w:cs="Segoe UI"/>
+          <w:sz w:val="21"/>
+          <w:szCs w:val="21"/>
+        </w:rPr>
+      </w:pPr>
       <w:r>
         <w:rPr>
           <w:rFonts w:ascii="Segoe UI" w:eastAsia="Times New Roman" w:hAnsi="Segoe UI" w:cs="Segoe UI"/>
           <w:b/>
           <w:bCs/>
-          <w:kern w:val="36"/>
-          <w:sz w:val="48"/>
-          <w:szCs w:val="48"/>
-        </w:rPr>
-        <w:t>Plus</w:t>
-      </w:r>
-      <w:proofErr w:type="gramEnd"/>
+          <w:sz w:val="21"/>
+          <w:szCs w:val="21"/>
+        </w:rPr>
+        <w:t>yearbook-choice</w:t>
+      </w:r>
+      <w:r>
+        <w:rPr>
+          <w:rFonts w:ascii="Segoe UI" w:eastAsia="Times New Roman" w:hAnsi="Segoe UI" w:cs="Segoe UI"/>
+          <w:sz w:val="21"/>
+          <w:szCs w:val="21"/>
+        </w:rPr>
+        <w:t> — Yearbook photo choice entry</w:t>
+      </w:r>
+    </w:p>
+    <w:p>
+      <w:pPr>
+        <w:numPr>
+          <w:ilvl w:val="0"/>
+          <w:numId w:val="4"/>
+        </w:numPr>
+        <w:spacing w:before="100" w:beforeAutospacing="1" w:after="100" w:afterAutospacing="1" w:line="240" w:lineRule="auto"/>
+        <w:rPr>
+          <w:rFonts w:ascii="Segoe UI" w:eastAsia="Times New Roman" w:hAnsi="Segoe UI" w:cs="Segoe UI"/>
+          <w:sz w:val="21"/>
+          <w:szCs w:val="21"/>
+        </w:rPr>
+      </w:pPr>
       <w:r>
         <w:rPr>
           <w:rFonts w:ascii="Segoe UI" w:eastAsia="Times New Roman" w:hAnsi="Segoe UI" w:cs="Segoe UI"/>
           <w:b/>
           <w:bCs/>
-          <w:kern w:val="36"/>
-          <w:sz w:val="48"/>
-          <w:szCs w:val="48"/>
-        </w:rPr>
-        <w:t xml:space="preserve"> Auto-Entry</w:t>
+          <w:sz w:val="21"/>
+          <w:szCs w:val="21"/>
+        </w:rPr>
+        <w:t>package-choice</w:t>
+      </w:r>
+      <w:r>
+        <w:rPr>
+          <w:rFonts w:ascii="Segoe UI" w:eastAsia="Times New Roman" w:hAnsi="Segoe UI" w:cs="Segoe UI"/>
+          <w:sz w:val="21"/>
+          <w:szCs w:val="21"/>
+        </w:rPr>
+        <w:t> — Package choice entry</w:t>
       </w:r>
     </w:p>
     <w:p>
       <w:pPr>
-        <w:spacing w:after="141" w:line="240" w:lineRule="auto"/>
-        <w:rPr>
-          <w:rFonts w:ascii="Segoe UI" w:eastAsia="Times New Roman" w:hAnsi="Segoe UI" w:cs="Segoe UI"/>
-          <w:sz w:val="12"/>
-          <w:szCs w:val="12"/>
-        </w:rPr>
-      </w:pPr>
-      <w:r>
-        <w:rPr>
-          <w:rFonts w:ascii="Segoe UI" w:eastAsia="Times New Roman" w:hAnsi="Segoe UI" w:cs="Segoe UI"/>
-          <w:sz w:val="12"/>
-          <w:szCs w:val="12"/>
-        </w:rPr>
-        <w:t>This folder contains the automation tools for entering student data.</w:t>
+        <w:spacing w:after="240" w:line="240" w:lineRule="auto"/>
+        <w:rPr>
+          <w:rFonts w:ascii="Segoe UI" w:eastAsia="Times New Roman" w:hAnsi="Segoe UI" w:cs="Segoe UI"/>
+          <w:sz w:val="21"/>
+          <w:szCs w:val="21"/>
+        </w:rPr>
+      </w:pPr>
+      <w:r>
+        <w:rPr>
+          <w:rFonts w:ascii="Segoe UI" w:eastAsia="Times New Roman" w:hAnsi="Segoe UI" w:cs="Segoe UI"/>
+          <w:sz w:val="21"/>
+          <w:szCs w:val="21"/>
+        </w:rPr>
+        <w:t>Each folder has its own run script. Use the one you need.</w:t>
       </w:r>
     </w:p>
     <w:p>
       <w:pPr>
-        <w:spacing w:before="212" w:after="141" w:line="240" w:lineRule="auto"/>
+        <w:spacing w:after="0" w:line="240" w:lineRule="auto"/>
+        <w:rPr>
+          <w:rFonts w:ascii="Segoe UI" w:eastAsia="Times New Roman" w:hAnsi="Segoe UI" w:cs="Segoe UI"/>
+          <w:sz w:val="21"/>
+          <w:szCs w:val="21"/>
+        </w:rPr>
+      </w:pPr>
+      <w:r>
+        <w:rPr>
+          <w:rFonts w:ascii="Times New Roman" w:eastAsia="Times New Roman" w:hAnsi="Times New Roman" w:cs="Times New Roman"/>
+          <w:noProof/>
+          <w:sz w:val="24"/>
+          <w:szCs w:val="24"/>
+        </w:rPr>
+        <w:pict w14:anchorId="7D88022B">
+          <v:rect id="_x0000_i1028" alt="" style="width:468pt;height:.05pt;mso-width-percent:0;mso-height-percent:0;mso-width-percent:0;mso-height-percent:0" o:hralign="center" o:hrstd="t" o:hr="t" fillcolor="#a0a0a0" stroked="f"/>
+        </w:pict>
+      </w:r>
+    </w:p>
+    <w:p>
+      <w:pPr>
+        <w:spacing w:before="360" w:after="240" w:line="240" w:lineRule="auto"/>
         <w:outlineLvl w:val="1"/>
         <w:rPr>
           <w:rFonts w:ascii="Segoe UI" w:eastAsia="Times New Roman" w:hAnsi="Segoe UI" w:cs="Segoe UI"/>
@@ -89,14 +168,14 @@
           <w:sz w:val="36"/>
           <w:szCs w:val="36"/>
         </w:rPr>
-        <w:t>Initial Setup (Do this once)</w:t>
+        <w:t>Yearbook choice</w:t>
       </w:r>
     </w:p>
     <w:p>
       <w:pPr>
         <w:numPr>
           <w:ilvl w:val="0"/>
-          <w:numId w:val="1"/>
+          <w:numId w:val="5"/>
         </w:numPr>
         <w:spacing w:before="100" w:beforeAutospacing="1" w:after="100" w:afterAutospacing="1" w:line="240" w:lineRule="auto"/>
         <w:rPr>
@@ -108,27 +187,53 @@
       <w:r>
         <w:rPr>
           <w:rFonts w:ascii="Segoe UI" w:eastAsia="Times New Roman" w:hAnsi="Segoe UI" w:cs="Segoe UI"/>
+          <w:sz w:val="21"/>
+          <w:szCs w:val="21"/>
+        </w:rPr>
+        <w:t>Put </w:t>
+      </w:r>
+      <w:r>
+        <w:rPr>
+          <w:rFonts w:ascii="Segoe UI" w:eastAsia="Times New Roman" w:hAnsi="Segoe UI" w:cs="Segoe UI"/>
           <w:b/>
           <w:bCs/>
           <w:sz w:val="21"/>
           <w:szCs w:val="21"/>
         </w:rPr>
-        <w:t>Install Libraries</w:t>
-      </w:r>
-      <w:r>
-        <w:rPr>
-          <w:rFonts w:ascii="Segoe UI" w:eastAsia="Times New Roman" w:hAnsi="Segoe UI" w:cs="Segoe UI"/>
-          <w:sz w:val="21"/>
-          <w:szCs w:val="21"/>
-        </w:rPr>
-        <w:t>:</w:t>
+        <w:t>one</w:t>
+      </w:r>
+      <w:r>
+        <w:rPr>
+          <w:rFonts w:ascii="Segoe UI" w:eastAsia="Times New Roman" w:hAnsi="Segoe UI" w:cs="Segoe UI"/>
+          <w:sz w:val="21"/>
+          <w:szCs w:val="21"/>
+        </w:rPr>
+        <w:t> Excel file in the </w:t>
+      </w:r>
+      <w:r>
+        <w:rPr>
+          <w:rFonts w:ascii="Segoe UI" w:eastAsia="Times New Roman" w:hAnsi="Segoe UI" w:cs="Segoe UI"/>
+          <w:b/>
+          <w:bCs/>
+          <w:sz w:val="21"/>
+          <w:szCs w:val="21"/>
+        </w:rPr>
+        <w:t>yearbook-choice</w:t>
+      </w:r>
+      <w:r>
+        <w:rPr>
+          <w:rFonts w:ascii="Segoe UI" w:eastAsia="Times New Roman" w:hAnsi="Segoe UI" w:cs="Segoe UI"/>
+          <w:sz w:val="21"/>
+          <w:szCs w:val="21"/>
+        </w:rPr>
+        <w:t> folder (same folder as the run script).</w:t>
       </w:r>
     </w:p>
     <w:p>
       <w:pPr>
         <w:numPr>
-          <w:ilvl w:val="1"/>
-          <w:numId w:val="1"/>
+          <w:ilvl w:val="0"/>
+          <w:numId w:val="5"/>
         </w:numPr>
         <w:spacing w:before="100" w:beforeAutospacing="1" w:after="100" w:afterAutospacing="1" w:line="240" w:lineRule="auto"/>
         <w:rPr>
@@ -143,14 +248,49 @@
           <w:sz w:val="21"/>
           <w:szCs w:val="21"/>
         </w:rPr>
-        <w:t>Double-click [0_Install_Dependencies.bat]</w:t>
+        <w:t>Double-click </w:t>
+      </w:r>
+      <w:r>
+        <w:rPr>
+          <w:rFonts w:ascii="Segoe UI" w:eastAsia="Times New Roman" w:hAnsi="Segoe UI" w:cs="Segoe UI"/>
+          <w:b/>
+          <w:bCs/>
+          <w:sz w:val="21"/>
+          <w:szCs w:val="21"/>
+        </w:rPr>
+        <w:t>Run_Yearbook_Choice.bat</w:t>
+      </w:r>
+      <w:r>
+        <w:rPr>
+          <w:rFonts w:ascii="Segoe UI" w:eastAsia="Times New Roman" w:hAnsi="Segoe UI" w:cs="Segoe UI"/>
+          <w:sz w:val="21"/>
+          <w:szCs w:val="21"/>
+        </w:rPr>
+        <w:t> (Windows) inside </w:t>
+      </w:r>
+      <w:r>
+        <w:rPr>
+          <w:rFonts w:ascii="Menlo" w:eastAsia="Times New Roman" w:hAnsi="Menlo" w:cs="Menlo"/>
+          <w:color w:val="88C0D0"/>
+          <w:sz w:val="21"/>
+          <w:szCs w:val="21"/>
+        </w:rPr>
+        <w:t>yearbook-choice</w:t>
+      </w:r>
+      <w:r>
+        <w:rPr>
+          <w:rFonts w:ascii="Segoe UI" w:eastAsia="Times New Roman" w:hAnsi="Segoe UI" w:cs="Segoe UI"/>
+          <w:sz w:val="21"/>
+          <w:szCs w:val="21"/>
+        </w:rPr>
+        <w:t>.</w:t>
       </w:r>
     </w:p>
     <w:p>
       <w:pPr>
         <w:numPr>
-          <w:ilvl w:val="1"/>
-          <w:numId w:val="1"/>
+          <w:ilvl w:val="0"/>
+          <w:numId w:val="5"/>
         </w:numPr>
         <w:spacing w:before="100" w:beforeAutospacing="1" w:after="100" w:afterAutospacing="1" w:line="240" w:lineRule="auto"/>
         <w:rPr>
@@ -165,22 +305,55 @@
           <w:sz w:val="21"/>
           <w:szCs w:val="21"/>
         </w:rPr>
-        <w:t>Wait for it to say "Requirements installed successfully!</w:t>
-      </w:r>
-      <w:proofErr w:type="gramStart"/>
-      <w:r>
-        <w:rPr>
-          <w:rFonts w:ascii="Segoe UI" w:eastAsia="Times New Roman" w:hAnsi="Segoe UI" w:cs="Segoe UI"/>
-          <w:sz w:val="21"/>
-          <w:szCs w:val="21"/>
-        </w:rPr>
-        <w:t>".</w:t>
-      </w:r>
-      <w:proofErr w:type="gramEnd"/>
+        <w:t>Do Step 1 (validation), then Step 2 (click where the program asks), then Step 3 (automation runs).</w:t>
+      </w:r>
     </w:p>
     <w:p>
       <w:pPr>
-        <w:spacing w:before="212" w:after="141" w:line="240" w:lineRule="auto"/>
+        <w:numPr>
+          <w:ilvl w:val="0"/>
+          <w:numId w:val="5"/>
+        </w:numPr>
+        <w:spacing w:before="100" w:beforeAutospacing="1" w:after="100" w:afterAutospacing="1" w:line="240" w:lineRule="auto"/>
+        <w:rPr>
+          <w:rFonts w:ascii="Segoe UI" w:eastAsia="Times New Roman" w:hAnsi="Segoe UI" w:cs="Segoe UI"/>
+          <w:sz w:val="21"/>
+          <w:szCs w:val="21"/>
+        </w:rPr>
+      </w:pPr>
+      <w:r>
+        <w:rPr>
+          <w:rFonts w:ascii="Segoe UI" w:eastAsia="Times New Roman" w:hAnsi="Segoe UI" w:cs="Segoe UI"/>
+          <w:sz w:val="21"/>
+          <w:szCs w:val="21"/>
+        </w:rPr>
+        <w:t>To stop: move the mouse to a corner of the screen.</w:t>
+      </w:r>
+    </w:p>
+    <w:p>
+      <w:pPr>
+        <w:spacing w:after="0" w:line="240" w:lineRule="auto"/>
+        <w:rPr>
+          <w:rFonts w:ascii="Segoe UI" w:eastAsia="Times New Roman" w:hAnsi="Segoe UI" w:cs="Segoe UI"/>
+          <w:sz w:val="21"/>
+          <w:szCs w:val="21"/>
+        </w:rPr>
+      </w:pPr>
+      <w:r>
+        <w:rPr>
+          <w:rFonts w:ascii="Times New Roman" w:eastAsia="Times New Roman" w:hAnsi="Times New Roman" w:cs="Times New Roman"/>
+          <w:noProof/>
+          <w:sz w:val="24"/>
+          <w:szCs w:val="24"/>
+        </w:rPr>
+        <w:pict w14:anchorId="2171D06E">
+          <v:rect id="_x0000_i1027" alt="" style="width:468pt;height:.05pt;mso-width-percent:0;mso-height-percent:0;mso-width-percent:0;mso-height-percent:0" o:hralign="center" o:hrstd="t" o:hr="t" fillcolor="#a0a0a0" stroked="f"/>
+        </w:pict>
+      </w:r>
+    </w:p>
+    <w:p>
+      <w:pPr>
+        <w:spacing w:before="360" w:after="240" w:line="240" w:lineRule="auto"/>
         <w:outlineLvl w:val="1"/>
         <w:rPr>
           <w:rFonts w:ascii="Segoe UI" w:eastAsia="Times New Roman" w:hAnsi="Segoe UI" w:cs="Segoe UI"/>
@@ -198,37 +371,72 @@
           <w:sz w:val="36"/>
           <w:szCs w:val="36"/>
         </w:rPr>
-        <w:t>How to Use</w:t>
+        <w:t>Package choice</w:t>
       </w:r>
     </w:p>
     <w:p>
       <w:pPr>
-        <w:spacing w:before="212" w:after="141" w:line="240" w:lineRule="auto"/>
-        <w:outlineLvl w:val="2"/>
+        <w:numPr>
+          <w:ilvl w:val="0"/>
+          <w:numId w:val="6"/>
+        </w:numPr>
+        <w:spacing w:before="100" w:beforeAutospacing="1" w:after="100" w:afterAutospacing="1" w:line="240" w:lineRule="auto"/>
+        <w:rPr>
+          <w:rFonts w:ascii="Segoe UI" w:eastAsia="Times New Roman" w:hAnsi="Segoe UI" w:cs="Segoe UI"/>
+          <w:sz w:val="21"/>
+          <w:szCs w:val="21"/>
+        </w:rPr>
+      </w:pPr>
+      <w:r>
+        <w:rPr>
+          <w:rFonts w:ascii="Segoe UI" w:eastAsia="Times New Roman" w:hAnsi="Segoe UI" w:cs="Segoe UI"/>
+          <w:sz w:val="21"/>
+          <w:szCs w:val="21"/>
+        </w:rPr>
+        <w:t>Put </w:t>
+      </w:r>
+      <w:r>
         <w:rPr>
           <w:rFonts w:ascii="Segoe UI" w:eastAsia="Times New Roman" w:hAnsi="Segoe UI" w:cs="Segoe UI"/>
           <w:b/>
           <w:bCs/>
-          <w:sz w:val="30"/>
-          <w:szCs w:val="30"/>
-        </w:rPr>
-      </w:pPr>
+          <w:sz w:val="21"/>
+          <w:szCs w:val="21"/>
+        </w:rPr>
+        <w:t>one</w:t>
+      </w:r>
+      <w:r>
+        <w:rPr>
+          <w:rFonts w:ascii="Segoe UI" w:eastAsia="Times New Roman" w:hAnsi="Segoe UI" w:cs="Segoe UI"/>
+          <w:sz w:val="21"/>
+          <w:szCs w:val="21"/>
+        </w:rPr>
+        <w:t> Excel file in the </w:t>
+      </w:r>
       <w:r>
         <w:rPr>
           <w:rFonts w:ascii="Segoe UI" w:eastAsia="Times New Roman" w:hAnsi="Segoe UI" w:cs="Segoe UI"/>
           <w:b/>
           <w:bCs/>
-          <w:sz w:val="30"/>
-          <w:szCs w:val="30"/>
-        </w:rPr>
-        <w:t>Step 1: Teach the Robot and Run the Automation</w:t>
+          <w:sz w:val="21"/>
+          <w:szCs w:val="21"/>
+        </w:rPr>
+        <w:t>package-choice</w:t>
+      </w:r>
+      <w:r>
+        <w:rPr>
+          <w:rFonts w:ascii="Segoe UI" w:eastAsia="Times New Roman" w:hAnsi="Segoe UI" w:cs="Segoe UI"/>
+          <w:sz w:val="21"/>
+          <w:szCs w:val="21"/>
+        </w:rPr>
+        <w:t> folder (same folder as the run script).</w:t>
       </w:r>
     </w:p>
     <w:p>
       <w:pPr>
         <w:numPr>
           <w:ilvl w:val="0"/>
-          <w:numId w:val="2"/>
+          <w:numId w:val="6"/>
         </w:numPr>
         <w:spacing w:before="100" w:beforeAutospacing="1" w:after="100" w:afterAutospacing="1" w:line="240" w:lineRule="auto"/>
         <w:rPr>
@@ -243,7 +451,7 @@
           <w:sz w:val="21"/>
           <w:szCs w:val="21"/>
         </w:rPr>
-        <w:t>Open </w:t>
+        <w:t>Double-click </w:t>
       </w:r>
       <w:r>
         <w:rPr>
@@ -253,7 +461,42 @@
           <w:sz w:val="21"/>
           <w:szCs w:val="21"/>
         </w:rPr>
-        <w:t>School Days Plus</w:t>
+        <w:t>Run_Package_Choice.bat</w:t>
+      </w:r>
+      <w:r>
+        <w:rPr>
+          <w:rFonts w:ascii="Segoe UI" w:eastAsia="Times New Roman" w:hAnsi="Segoe UI" w:cs="Segoe UI"/>
+          <w:sz w:val="21"/>
+          <w:szCs w:val="21"/>
+        </w:rPr>
+        <w:t> (Windows) or </w:t>
+      </w:r>
+      <w:r>
+        <w:rPr>
+          <w:rFonts w:ascii="Segoe UI" w:eastAsia="Times New Roman" w:hAnsi="Segoe UI" w:cs="Segoe UI"/>
+          <w:b/>
+          <w:bCs/>
+          <w:sz w:val="21"/>
+          <w:szCs w:val="21"/>
+        </w:rPr>
+        <w:t>Run_Package_Choice.command</w:t>
+      </w:r>
+      <w:r>
+        <w:rPr>
+          <w:rFonts w:ascii="Segoe UI" w:eastAsia="Times New Roman" w:hAnsi="Segoe UI" w:cs="Segoe UI"/>
+          <w:sz w:val="21"/>
+          <w:szCs w:val="21"/>
+        </w:rPr>
+        <w:t> (Mac) inside </w:t>
+      </w:r>
+      <w:r>
+        <w:rPr>
+          <w:rFonts w:ascii="Menlo" w:eastAsia="Times New Roman" w:hAnsi="Menlo" w:cs="Menlo"/>
+          <w:color w:val="88C0D0"/>
+          <w:sz w:val="21"/>
+          <w:szCs w:val="21"/>
+        </w:rPr>
+        <w:t>package-choice</w:t>
       </w:r>
       <w:r>
         <w:rPr>
@@ -268,7 +511,7 @@
       <w:pPr>
         <w:numPr>
           <w:ilvl w:val="0"/>
-          <w:numId w:val="2"/>
+          <w:numId w:val="6"/>
         </w:numPr>
         <w:spacing w:before="100" w:beforeAutospacing="1" w:after="100" w:afterAutospacing="1" w:line="240" w:lineRule="auto"/>
         <w:rPr>
@@ -283,31 +526,14 @@
           <w:sz w:val="21"/>
           <w:szCs w:val="21"/>
         </w:rPr>
-        <w:t>Make sure only one excel file exists inside of the same folder as [</w:t>
-      </w:r>
-      <w:r>
-        <w:rPr>
-          <w:rFonts w:ascii="Segoe UI" w:eastAsia="Times New Roman" w:hAnsi="Segoe UI" w:cs="Segoe UI"/>
-          <w:i/>
-          <w:sz w:val="21"/>
-          <w:szCs w:val="21"/>
-        </w:rPr>
-        <w:t>Run_Schooldays_Automation_Yearbook_Photo_Choice.bat</w:t>
-      </w:r>
-      <w:r>
-        <w:rPr>
-          <w:rFonts w:ascii="Segoe UI" w:eastAsia="Times New Roman" w:hAnsi="Segoe UI" w:cs="Segoe UI"/>
-          <w:sz w:val="21"/>
-          <w:szCs w:val="21"/>
-        </w:rPr>
-        <w:t>]. It can exist in any other folder (including the child folders), but not in the same folder as the .bat file.</w:t>
+        <w:t>Do Step 1 (validation), then Step 2 (click where the program asks), then Step 3 (automation runs).</w:t>
       </w:r>
     </w:p>
     <w:p>
       <w:pPr>
         <w:numPr>
           <w:ilvl w:val="0"/>
-          <w:numId w:val="2"/>
+          <w:numId w:val="6"/>
         </w:numPr>
         <w:spacing w:before="100" w:beforeAutospacing="1" w:after="100" w:afterAutospacing="1" w:line="240" w:lineRule="auto"/>
         <w:rPr>
@@ -322,130 +548,33 @@
           <w:sz w:val="21"/>
           <w:szCs w:val="21"/>
         </w:rPr>
-        <w:t>Double-click [</w:t>
-      </w:r>
-      <w:r>
-        <w:rPr>
-          <w:rFonts w:ascii="Segoe UI" w:eastAsia="Times New Roman" w:hAnsi="Segoe UI" w:cs="Segoe UI"/>
-          <w:i/>
-          <w:sz w:val="21"/>
-          <w:szCs w:val="21"/>
-        </w:rPr>
-        <w:t>Run_Schooldays_Automation_Yearbook_Photo_Choice.bat</w:t>
-      </w:r>
-      <w:r>
-        <w:rPr>
-          <w:rFonts w:ascii="Segoe UI" w:eastAsia="Times New Roman" w:hAnsi="Segoe UI" w:cs="Segoe UI"/>
-          <w:sz w:val="21"/>
-          <w:szCs w:val="21"/>
-        </w:rPr>
-        <w:t>]</w:t>
+        <w:t>To stop: move the mouse to a corner of the screen.</w:t>
       </w:r>
     </w:p>
     <w:p>
       <w:pPr>
-        <w:numPr>
-          <w:ilvl w:val="0"/>
-          <w:numId w:val="2"/>
-        </w:numPr>
-        <w:spacing w:before="100" w:beforeAutospacing="1" w:after="100" w:afterAutospacing="1" w:line="240" w:lineRule="auto"/>
-        <w:rPr>
-          <w:rFonts w:ascii="Segoe UI" w:eastAsia="Times New Roman" w:hAnsi="Segoe UI" w:cs="Segoe UI"/>
-          <w:sz w:val="21"/>
-          <w:szCs w:val="21"/>
-        </w:rPr>
-      </w:pPr>
-      <w:r>
-        <w:rPr>
-          <w:rFonts w:ascii="Segoe UI" w:eastAsia="Times New Roman" w:hAnsi="Segoe UI" w:cs="Segoe UI"/>
-          <w:sz w:val="21"/>
-          <w:szCs w:val="21"/>
-        </w:rPr>
-        <w:t>Follow the instructions on the black screen. Use your mouse to point at the buttons it asks for, and press </w:t>
-      </w:r>
-      <w:r>
-        <w:rPr>
-          <w:rFonts w:ascii="Segoe UI" w:eastAsia="Times New Roman" w:hAnsi="Segoe UI" w:cs="Segoe UI"/>
-          <w:b/>
-          <w:bCs/>
-          <w:sz w:val="21"/>
-          <w:szCs w:val="21"/>
-        </w:rPr>
-        <w:t>ENTER</w:t>
-      </w:r>
-      <w:r>
-        <w:rPr>
-          <w:rFonts w:ascii="Segoe UI" w:eastAsia="Times New Roman" w:hAnsi="Segoe UI" w:cs="Segoe UI"/>
-          <w:sz w:val="21"/>
-          <w:szCs w:val="21"/>
-        </w:rPr>
-        <w:t> on your keyboard to save the input spots.</w:t>
-      </w:r>
-      <w:r>
-        <w:rPr>
-          <w:rFonts w:ascii="Segoe UI" w:hAnsi="Segoe UI" w:cs="Segoe UI" w:hint="eastAsia"/>
-          <w:sz w:val="21"/>
-          <w:szCs w:val="21"/>
-        </w:rPr>
-        <w:t xml:space="preserve"> Do not press schooldays application. If you do, no worries! Click back to the program window to continue as normal.</w:t>
+        <w:spacing w:after="0" w:line="240" w:lineRule="auto"/>
+        <w:rPr>
+          <w:rFonts w:ascii="Segoe UI" w:eastAsia="Times New Roman" w:hAnsi="Segoe UI" w:cs="Segoe UI"/>
+          <w:sz w:val="21"/>
+          <w:szCs w:val="21"/>
+        </w:rPr>
+      </w:pPr>
+      <w:r>
+        <w:rPr>
+          <w:rFonts w:ascii="Times New Roman" w:eastAsia="Times New Roman" w:hAnsi="Times New Roman" w:cs="Times New Roman"/>
+          <w:noProof/>
+          <w:sz w:val="24"/>
+          <w:szCs w:val="24"/>
+        </w:rPr>
+        <w:pict w14:anchorId="589636B5">
+          <v:rect id="_x0000_i1026" alt="" style="width:468pt;height:.05pt;mso-width-percent:0;mso-height-percent:0;mso-width-percent:0;mso-height-percent:0" o:hralign="center" o:hrstd="t" o:hr="t" fillcolor="#a0a0a0" stroked="f"/>
+        </w:pict>
       </w:r>
     </w:p>
     <w:p>
       <w:pPr>
-        <w:numPr>
-          <w:ilvl w:val="0"/>
-          <w:numId w:val="2"/>
-        </w:numPr>
-        <w:spacing w:before="100" w:beforeAutospacing="1" w:after="100" w:afterAutospacing="1" w:line="240" w:lineRule="auto"/>
-        <w:rPr>
-          <w:rFonts w:ascii="Segoe UI" w:eastAsia="Times New Roman" w:hAnsi="Segoe UI" w:cs="Segoe UI"/>
-          <w:sz w:val="21"/>
-          <w:szCs w:val="21"/>
-        </w:rPr>
-      </w:pPr>
-      <w:r>
-        <w:rPr>
-          <w:rFonts w:ascii="Segoe UI" w:eastAsia="Times New Roman" w:hAnsi="Segoe UI" w:cs="Segoe UI"/>
-          <w:sz w:val="21"/>
-          <w:szCs w:val="21"/>
-        </w:rPr>
-        <w:t xml:space="preserve">Sit back and watch! </w:t>
-      </w:r>
-      <w:r>
-        <w:rPr>
-          <w:rFonts w:ascii="Segoe UI" w:eastAsia="Times New Roman" w:hAnsi="Segoe UI" w:cs="Segoe UI"/>
-          <w:b/>
-          <w:sz w:val="21"/>
-          <w:szCs w:val="21"/>
-        </w:rPr>
-        <w:t>To stop it immediately, move your mouse to any corner of the screen.</w:t>
-      </w:r>
-    </w:p>
-    <w:p>
-      <w:pPr>
-        <w:numPr>
-          <w:ilvl w:val="0"/>
-          <w:numId w:val="2"/>
-        </w:numPr>
-        <w:spacing w:before="100" w:beforeAutospacing="1" w:after="100" w:afterAutospacing="1" w:line="240" w:lineRule="auto"/>
-        <w:rPr>
-          <w:rFonts w:ascii="Segoe UI" w:eastAsia="Times New Roman" w:hAnsi="Segoe UI" w:cs="Segoe UI"/>
-          <w:sz w:val="21"/>
-          <w:szCs w:val="21"/>
-        </w:rPr>
-      </w:pPr>
-      <w:r>
-        <w:rPr>
-          <w:rFonts w:ascii="Segoe UI" w:eastAsia="Times New Roman" w:hAnsi="Segoe UI" w:cs="Segoe UI"/>
-          <w:sz w:val="21"/>
-          <w:szCs w:val="21"/>
-        </w:rPr>
-        <w:t>Program will notify you of the end of the process. You can press any key to escape or click "x" on the window when done.</w:t>
-      </w:r>
-    </w:p>
-    <w:p>
-      <w:pPr>
-        <w:spacing w:before="212" w:after="141" w:line="240" w:lineRule="auto"/>
+        <w:spacing w:before="360" w:after="240" w:line="240" w:lineRule="auto"/>
         <w:outlineLvl w:val="1"/>
         <w:rPr>
           <w:rFonts w:ascii="Segoe UI" w:eastAsia="Times New Roman" w:hAnsi="Segoe UI" w:cs="Segoe UI"/>
@@ -463,14 +592,693 @@
           <w:sz w:val="36"/>
           <w:szCs w:val="36"/>
         </w:rPr>
-        <w:t>Troubleshooting</w:t>
+        <w:t>Output files</w:t>
       </w:r>
     </w:p>
     <w:p>
       <w:pPr>
+        <w:spacing w:after="240" w:line="240" w:lineRule="auto"/>
+        <w:rPr>
+          <w:rFonts w:ascii="Segoe UI" w:eastAsia="Times New Roman" w:hAnsi="Segoe UI" w:cs="Segoe UI"/>
+          <w:sz w:val="21"/>
+          <w:szCs w:val="21"/>
+        </w:rPr>
+      </w:pPr>
+      <w:r>
+        <w:rPr>
+          <w:rFonts w:ascii="Segoe UI" w:eastAsia="Times New Roman" w:hAnsi="Segoe UI" w:cs="Segoe UI"/>
+          <w:sz w:val="21"/>
+          <w:szCs w:val="21"/>
+        </w:rPr>
+        <w:t>All of these are created in a </w:t>
+      </w:r>
+      <w:r>
+        <w:rPr>
+          <w:rFonts w:ascii="Segoe UI" w:eastAsia="Times New Roman" w:hAnsi="Segoe UI" w:cs="Segoe UI"/>
+          <w:b/>
+          <w:bCs/>
+          <w:sz w:val="21"/>
+          <w:szCs w:val="21"/>
+        </w:rPr>
+        <w:t>reports</w:t>
+      </w:r>
+      <w:r>
+        <w:rPr>
+          <w:rFonts w:ascii="Segoe UI" w:eastAsia="Times New Roman" w:hAnsi="Segoe UI" w:cs="Segoe UI"/>
+          <w:sz w:val="21"/>
+          <w:szCs w:val="21"/>
+        </w:rPr>
+        <w:t> folder inside the automation folder you ran (e.g. </w:t>
+      </w:r>
+      <w:r>
+        <w:rPr>
+          <w:rFonts w:ascii="Menlo" w:eastAsia="Times New Roman" w:hAnsi="Menlo" w:cs="Menlo"/>
+          <w:color w:val="88C0D0"/>
+          <w:sz w:val="21"/>
+          <w:szCs w:val="21"/>
+        </w:rPr>
+        <w:t>yearbook-choice/reports</w:t>
+      </w:r>
+      <w:r>
+        <w:rPr>
+          <w:rFonts w:ascii="Segoe UI" w:eastAsia="Times New Roman" w:hAnsi="Segoe UI" w:cs="Segoe UI"/>
+          <w:sz w:val="21"/>
+          <w:szCs w:val="21"/>
+        </w:rPr>
+        <w:t> or </w:t>
+      </w:r>
+      <w:r>
+        <w:rPr>
+          <w:rFonts w:ascii="Menlo" w:eastAsia="Times New Roman" w:hAnsi="Menlo" w:cs="Menlo"/>
+          <w:color w:val="88C0D0"/>
+          <w:sz w:val="21"/>
+          <w:szCs w:val="21"/>
+        </w:rPr>
+        <w:t>package-choice/reports</w:t>
+      </w:r>
+      <w:r>
+        <w:rPr>
+          <w:rFonts w:ascii="Segoe UI" w:eastAsia="Times New Roman" w:hAnsi="Segoe UI" w:cs="Segoe UI"/>
+          <w:sz w:val="21"/>
+          <w:szCs w:val="21"/>
+        </w:rPr>
+        <w:t>).</w:t>
+      </w:r>
+    </w:p>
+    <w:tbl>
+      <w:tblPr>
+        <w:tblW w:w="0" w:type="auto"/>
+        <w:tblCellMar>
+          <w:top w:w="15" w:type="dxa"/>
+          <w:left w:w="15" w:type="dxa"/>
+          <w:bottom w:w="15" w:type="dxa"/>
+          <w:right w:w="15" w:type="dxa"/>
+        </w:tblCellMar>
+        <w:tblLook w:val="04A0" w:firstRow="1" w:lastRow="0" w:firstColumn="1" w:lastColumn="0" w:noHBand="0" w:noVBand="1"/>
+      </w:tblPr>
+      <w:tblGrid>
+        <w:gridCol w:w="3351"/>
+        <w:gridCol w:w="6309"/>
+      </w:tblGrid>
+      <w:tr>
+        <w:trPr>
+          <w:tblHeader/>
+        </w:trPr>
+        <w:tc>
+          <w:tcPr>
+            <w:tcW w:w="0" w:type="auto"/>
+            <w:tcMar>
+              <w:top w:w="75" w:type="dxa"/>
+              <w:left w:w="150" w:type="dxa"/>
+              <w:bottom w:w="75" w:type="dxa"/>
+              <w:right w:w="150" w:type="dxa"/>
+            </w:tcMar>
+            <w:vAlign w:val="center"/>
+            <w:hideMark/>
+          </w:tcPr>
+          <w:p>
+            <w:pPr>
+              <w:spacing w:after="168" w:line="240" w:lineRule="auto"/>
+              <w:rPr>
+                <w:rFonts w:ascii="Segoe UI" w:eastAsia="Times New Roman" w:hAnsi="Segoe UI" w:cs="Segoe UI"/>
+                <w:b/>
+                <w:bCs/>
+                <w:sz w:val="21"/>
+                <w:szCs w:val="21"/>
+              </w:rPr>
+            </w:pPr>
+            <w:r>
+              <w:rPr>
+                <w:rFonts w:ascii="Segoe UI" w:eastAsia="Times New Roman" w:hAnsi="Segoe UI" w:cs="Segoe UI"/>
+                <w:b/>
+                <w:bCs/>
+                <w:sz w:val="21"/>
+                <w:szCs w:val="21"/>
+              </w:rPr>
+              <w:t>File</w:t>
+            </w:r>
+          </w:p>
+        </w:tc>
+        <w:tc>
+          <w:tcPr>
+            <w:tcW w:w="0" w:type="auto"/>
+            <w:tcMar>
+              <w:top w:w="75" w:type="dxa"/>
+              <w:left w:w="150" w:type="dxa"/>
+              <w:bottom w:w="75" w:type="dxa"/>
+              <w:right w:w="150" w:type="dxa"/>
+            </w:tcMar>
+            <w:vAlign w:val="center"/>
+            <w:hideMark/>
+          </w:tcPr>
+          <w:p>
+            <w:pPr>
+              <w:spacing w:after="168" w:line="240" w:lineRule="auto"/>
+              <w:rPr>
+                <w:rFonts w:ascii="Segoe UI" w:eastAsia="Times New Roman" w:hAnsi="Segoe UI" w:cs="Segoe UI"/>
+                <w:b/>
+                <w:bCs/>
+                <w:sz w:val="21"/>
+                <w:szCs w:val="21"/>
+              </w:rPr>
+            </w:pPr>
+            <w:r>
+              <w:rPr>
+                <w:rFonts w:ascii="Segoe UI" w:eastAsia="Times New Roman" w:hAnsi="Segoe UI" w:cs="Segoe UI"/>
+                <w:b/>
+                <w:bCs/>
+                <w:sz w:val="21"/>
+                <w:szCs w:val="21"/>
+              </w:rPr>
+              <w:t>Meaning</w:t>
+            </w:r>
+          </w:p>
+        </w:tc>
+      </w:tr>
+      <w:tr>
+        <w:tc>
+          <w:tcPr>
+            <w:tcW w:w="0" w:type="auto"/>
+            <w:tcMar>
+              <w:top w:w="75" w:type="dxa"/>
+              <w:left w:w="150" w:type="dxa"/>
+              <w:bottom w:w="75" w:type="dxa"/>
+              <w:right w:w="150" w:type="dxa"/>
+            </w:tcMar>
+            <w:vAlign w:val="center"/>
+            <w:hideMark/>
+          </w:tcPr>
+          <w:p>
+            <w:pPr>
+              <w:spacing w:after="168" w:line="240" w:lineRule="auto"/>
+              <w:rPr>
+                <w:rFonts w:ascii="Segoe UI" w:eastAsia="Times New Roman" w:hAnsi="Segoe UI" w:cs="Segoe UI"/>
+                <w:sz w:val="21"/>
+                <w:szCs w:val="21"/>
+              </w:rPr>
+            </w:pPr>
+            <w:r>
+              <w:rPr>
+                <w:rFonts w:ascii="Segoe UI" w:eastAsia="Times New Roman" w:hAnsi="Segoe UI" w:cs="Segoe UI"/>
+                <w:b/>
+                <w:bCs/>
+                <w:sz w:val="21"/>
+                <w:szCs w:val="21"/>
+              </w:rPr>
+              <w:t>yearbook-choice-errors-</w:t>
+            </w:r>
+            <w:r>
+              <w:rPr>
+                <w:rFonts w:ascii="Segoe UI" w:eastAsia="Times New Roman" w:hAnsi="Segoe UI" w:cs="Segoe UI"/>
+                <w:sz w:val="21"/>
+                <w:szCs w:val="21"/>
+              </w:rPr>
+              <w:t>…</w:t>
+            </w:r>
+            <w:r>
+              <w:rPr>
+                <w:rFonts w:ascii="Segoe UI" w:eastAsia="Times New Roman" w:hAnsi="Segoe UI" w:cs="Segoe UI"/>
+                <w:b/>
+                <w:bCs/>
+                <w:sz w:val="21"/>
+                <w:szCs w:val="21"/>
+              </w:rPr>
+              <w:t>.xlsx</w:t>
+            </w:r>
+          </w:p>
+        </w:tc>
+        <w:tc>
+          <w:tcPr>
+            <w:tcW w:w="0" w:type="auto"/>
+            <w:tcMar>
+              <w:top w:w="75" w:type="dxa"/>
+              <w:left w:w="150" w:type="dxa"/>
+              <w:bottom w:w="75" w:type="dxa"/>
+              <w:right w:w="150" w:type="dxa"/>
+            </w:tcMar>
+            <w:vAlign w:val="center"/>
+            <w:hideMark/>
+          </w:tcPr>
+          <w:p>
+            <w:pPr>
+              <w:spacing w:after="168" w:line="240" w:lineRule="auto"/>
+              <w:rPr>
+                <w:rFonts w:ascii="Segoe UI" w:eastAsia="Times New Roman" w:hAnsi="Segoe UI" w:cs="Segoe UI"/>
+                <w:sz w:val="21"/>
+                <w:szCs w:val="21"/>
+              </w:rPr>
+            </w:pPr>
+            <w:r>
+              <w:rPr>
+                <w:rFonts w:ascii="Segoe UI" w:eastAsia="Times New Roman" w:hAnsi="Segoe UI" w:cs="Segoe UI"/>
+                <w:sz w:val="21"/>
+                <w:szCs w:val="21"/>
+              </w:rPr>
+              <w:t>List of errors (validation or during run). Check this if something went wrong.</w:t>
+            </w:r>
+          </w:p>
+        </w:tc>
+      </w:tr>
+      <w:tr>
+        <w:tc>
+          <w:tcPr>
+            <w:tcW w:w="0" w:type="auto"/>
+            <w:tcMar>
+              <w:top w:w="75" w:type="dxa"/>
+              <w:left w:w="150" w:type="dxa"/>
+              <w:bottom w:w="75" w:type="dxa"/>
+              <w:right w:w="150" w:type="dxa"/>
+            </w:tcMar>
+            <w:vAlign w:val="center"/>
+            <w:hideMark/>
+          </w:tcPr>
+          <w:p>
+            <w:pPr>
+              <w:spacing w:after="168" w:line="240" w:lineRule="auto"/>
+              <w:rPr>
+                <w:rFonts w:ascii="Segoe UI" w:eastAsia="Times New Roman" w:hAnsi="Segoe UI" w:cs="Segoe UI"/>
+                <w:sz w:val="21"/>
+                <w:szCs w:val="21"/>
+              </w:rPr>
+            </w:pPr>
+            <w:r>
+              <w:rPr>
+                <w:rFonts w:ascii="Segoe UI" w:eastAsia="Times New Roman" w:hAnsi="Segoe UI" w:cs="Segoe UI"/>
+                <w:b/>
+                <w:bCs/>
+                <w:sz w:val="21"/>
+                <w:szCs w:val="21"/>
+              </w:rPr>
+              <w:lastRenderedPageBreak/>
+              <w:t>yearbook-choice-completed-</w:t>
+            </w:r>
+            <w:r>
+              <w:rPr>
+                <w:rFonts w:ascii="Segoe UI" w:eastAsia="Times New Roman" w:hAnsi="Segoe UI" w:cs="Segoe UI"/>
+                <w:sz w:val="21"/>
+                <w:szCs w:val="21"/>
+              </w:rPr>
+              <w:t>…</w:t>
+            </w:r>
+            <w:r>
+              <w:rPr>
+                <w:rFonts w:ascii="Segoe UI" w:eastAsia="Times New Roman" w:hAnsi="Segoe UI" w:cs="Segoe UI"/>
+                <w:b/>
+                <w:bCs/>
+                <w:sz w:val="21"/>
+                <w:szCs w:val="21"/>
+              </w:rPr>
+              <w:t>.xlsx</w:t>
+            </w:r>
+          </w:p>
+        </w:tc>
+        <w:tc>
+          <w:tcPr>
+            <w:tcW w:w="0" w:type="auto"/>
+            <w:tcMar>
+              <w:top w:w="75" w:type="dxa"/>
+              <w:left w:w="150" w:type="dxa"/>
+              <w:bottom w:w="75" w:type="dxa"/>
+              <w:right w:w="150" w:type="dxa"/>
+            </w:tcMar>
+            <w:vAlign w:val="center"/>
+            <w:hideMark/>
+          </w:tcPr>
+          <w:p>
+            <w:pPr>
+              <w:spacing w:after="168" w:line="240" w:lineRule="auto"/>
+              <w:rPr>
+                <w:rFonts w:ascii="Segoe UI" w:eastAsia="Times New Roman" w:hAnsi="Segoe UI" w:cs="Segoe UI"/>
+                <w:sz w:val="21"/>
+                <w:szCs w:val="21"/>
+              </w:rPr>
+            </w:pPr>
+            <w:r>
+              <w:rPr>
+                <w:rFonts w:ascii="Segoe UI" w:eastAsia="Times New Roman" w:hAnsi="Segoe UI" w:cs="Segoe UI"/>
+                <w:sz w:val="21"/>
+                <w:szCs w:val="21"/>
+              </w:rPr>
+              <w:t>List of students that were finished successfully.</w:t>
+            </w:r>
+          </w:p>
+        </w:tc>
+      </w:tr>
+      <w:tr>
+        <w:tc>
+          <w:tcPr>
+            <w:tcW w:w="0" w:type="auto"/>
+            <w:tcMar>
+              <w:top w:w="75" w:type="dxa"/>
+              <w:left w:w="150" w:type="dxa"/>
+              <w:bottom w:w="75" w:type="dxa"/>
+              <w:right w:w="150" w:type="dxa"/>
+            </w:tcMar>
+            <w:vAlign w:val="center"/>
+            <w:hideMark/>
+          </w:tcPr>
+          <w:p>
+            <w:pPr>
+              <w:spacing w:after="168" w:line="240" w:lineRule="auto"/>
+              <w:rPr>
+                <w:rFonts w:ascii="Segoe UI" w:eastAsia="Times New Roman" w:hAnsi="Segoe UI" w:cs="Segoe UI"/>
+                <w:sz w:val="21"/>
+                <w:szCs w:val="21"/>
+              </w:rPr>
+            </w:pPr>
+            <w:r>
+              <w:rPr>
+                <w:rFonts w:ascii="Segoe UI" w:eastAsia="Times New Roman" w:hAnsi="Segoe UI" w:cs="Segoe UI"/>
+                <w:b/>
+                <w:bCs/>
+                <w:sz w:val="21"/>
+                <w:szCs w:val="21"/>
+              </w:rPr>
+              <w:t>package-choice-errors-</w:t>
+            </w:r>
+            <w:r>
+              <w:rPr>
+                <w:rFonts w:ascii="Segoe UI" w:eastAsia="Times New Roman" w:hAnsi="Segoe UI" w:cs="Segoe UI"/>
+                <w:sz w:val="21"/>
+                <w:szCs w:val="21"/>
+              </w:rPr>
+              <w:t>…</w:t>
+            </w:r>
+            <w:r>
+              <w:rPr>
+                <w:rFonts w:ascii="Segoe UI" w:eastAsia="Times New Roman" w:hAnsi="Segoe UI" w:cs="Segoe UI"/>
+                <w:b/>
+                <w:bCs/>
+                <w:sz w:val="21"/>
+                <w:szCs w:val="21"/>
+              </w:rPr>
+              <w:t>.xlsx</w:t>
+            </w:r>
+          </w:p>
+        </w:tc>
+        <w:tc>
+          <w:tcPr>
+            <w:tcW w:w="0" w:type="auto"/>
+            <w:tcMar>
+              <w:top w:w="75" w:type="dxa"/>
+              <w:left w:w="150" w:type="dxa"/>
+              <w:bottom w:w="75" w:type="dxa"/>
+              <w:right w:w="150" w:type="dxa"/>
+            </w:tcMar>
+            <w:vAlign w:val="center"/>
+            <w:hideMark/>
+          </w:tcPr>
+          <w:p>
+            <w:pPr>
+              <w:spacing w:after="168" w:line="240" w:lineRule="auto"/>
+              <w:rPr>
+                <w:rFonts w:ascii="Segoe UI" w:eastAsia="Times New Roman" w:hAnsi="Segoe UI" w:cs="Segoe UI"/>
+                <w:sz w:val="21"/>
+                <w:szCs w:val="21"/>
+              </w:rPr>
+            </w:pPr>
+            <w:r>
+              <w:rPr>
+                <w:rFonts w:ascii="Segoe UI" w:eastAsia="Times New Roman" w:hAnsi="Segoe UI" w:cs="Segoe UI"/>
+                <w:sz w:val="21"/>
+                <w:szCs w:val="21"/>
+              </w:rPr>
+              <w:t>List of errors (data problems or during run). Check this if something went wrong.</w:t>
+            </w:r>
+          </w:p>
+        </w:tc>
+      </w:tr>
+      <w:tr>
+        <w:tc>
+          <w:tcPr>
+            <w:tcW w:w="0" w:type="auto"/>
+            <w:tcMar>
+              <w:top w:w="75" w:type="dxa"/>
+              <w:left w:w="150" w:type="dxa"/>
+              <w:bottom w:w="75" w:type="dxa"/>
+              <w:right w:w="150" w:type="dxa"/>
+            </w:tcMar>
+            <w:vAlign w:val="center"/>
+            <w:hideMark/>
+          </w:tcPr>
+          <w:p>
+            <w:pPr>
+              <w:spacing w:after="168" w:line="240" w:lineRule="auto"/>
+              <w:rPr>
+                <w:rFonts w:ascii="Segoe UI" w:eastAsia="Times New Roman" w:hAnsi="Segoe UI" w:cs="Segoe UI"/>
+                <w:sz w:val="21"/>
+                <w:szCs w:val="21"/>
+              </w:rPr>
+            </w:pPr>
+            <w:r>
+              <w:rPr>
+                <w:rFonts w:ascii="Segoe UI" w:eastAsia="Times New Roman" w:hAnsi="Segoe UI" w:cs="Segoe UI"/>
+                <w:b/>
+                <w:bCs/>
+                <w:sz w:val="21"/>
+                <w:szCs w:val="21"/>
+              </w:rPr>
+              <w:t>package-choice-completed-</w:t>
+            </w:r>
+            <w:r>
+              <w:rPr>
+                <w:rFonts w:ascii="Segoe UI" w:eastAsia="Times New Roman" w:hAnsi="Segoe UI" w:cs="Segoe UI"/>
+                <w:sz w:val="21"/>
+                <w:szCs w:val="21"/>
+              </w:rPr>
+              <w:t>…</w:t>
+            </w:r>
+            <w:r>
+              <w:rPr>
+                <w:rFonts w:ascii="Segoe UI" w:eastAsia="Times New Roman" w:hAnsi="Segoe UI" w:cs="Segoe UI"/>
+                <w:b/>
+                <w:bCs/>
+                <w:sz w:val="21"/>
+                <w:szCs w:val="21"/>
+              </w:rPr>
+              <w:t>.xlsx</w:t>
+            </w:r>
+          </w:p>
+        </w:tc>
+        <w:tc>
+          <w:tcPr>
+            <w:tcW w:w="0" w:type="auto"/>
+            <w:tcMar>
+              <w:top w:w="75" w:type="dxa"/>
+              <w:left w:w="150" w:type="dxa"/>
+              <w:bottom w:w="75" w:type="dxa"/>
+              <w:right w:w="150" w:type="dxa"/>
+            </w:tcMar>
+            <w:vAlign w:val="center"/>
+            <w:hideMark/>
+          </w:tcPr>
+          <w:p>
+            <w:pPr>
+              <w:spacing w:after="168" w:line="240" w:lineRule="auto"/>
+              <w:rPr>
+                <w:rFonts w:ascii="Segoe UI" w:eastAsia="Times New Roman" w:hAnsi="Segoe UI" w:cs="Segoe UI"/>
+                <w:sz w:val="21"/>
+                <w:szCs w:val="21"/>
+              </w:rPr>
+            </w:pPr>
+            <w:r>
+              <w:rPr>
+                <w:rFonts w:ascii="Segoe UI" w:eastAsia="Times New Roman" w:hAnsi="Segoe UI" w:cs="Segoe UI"/>
+                <w:sz w:val="21"/>
+                <w:szCs w:val="21"/>
+              </w:rPr>
+              <w:t>List of students that were finished successfully.</w:t>
+            </w:r>
+          </w:p>
+        </w:tc>
+      </w:tr>
+      <w:tr>
+        <w:tc>
+          <w:tcPr>
+            <w:tcW w:w="0" w:type="auto"/>
+            <w:tcMar>
+              <w:top w:w="75" w:type="dxa"/>
+              <w:left w:w="150" w:type="dxa"/>
+              <w:bottom w:w="75" w:type="dxa"/>
+              <w:right w:w="150" w:type="dxa"/>
+            </w:tcMar>
+            <w:vAlign w:val="center"/>
+            <w:hideMark/>
+          </w:tcPr>
+          <w:p>
+            <w:pPr>
+              <w:spacing w:after="168" w:line="240" w:lineRule="auto"/>
+              <w:rPr>
+                <w:rFonts w:ascii="Segoe UI" w:eastAsia="Times New Roman" w:hAnsi="Segoe UI" w:cs="Segoe UI"/>
+                <w:sz w:val="21"/>
+                <w:szCs w:val="21"/>
+              </w:rPr>
+            </w:pPr>
+            <w:r>
+              <w:rPr>
+                <w:rFonts w:ascii="Segoe UI" w:eastAsia="Times New Roman" w:hAnsi="Segoe UI" w:cs="Segoe UI"/>
+                <w:b/>
+                <w:bCs/>
+                <w:sz w:val="21"/>
+                <w:szCs w:val="21"/>
+              </w:rPr>
+              <w:t>package-choice-run-summary-</w:t>
+            </w:r>
+            <w:r>
+              <w:rPr>
+                <w:rFonts w:ascii="Segoe UI" w:eastAsia="Times New Roman" w:hAnsi="Segoe UI" w:cs="Segoe UI"/>
+                <w:sz w:val="21"/>
+                <w:szCs w:val="21"/>
+              </w:rPr>
+              <w:t>…</w:t>
+            </w:r>
+            <w:r>
+              <w:rPr>
+                <w:rFonts w:ascii="Segoe UI" w:eastAsia="Times New Roman" w:hAnsi="Segoe UI" w:cs="Segoe UI"/>
+                <w:b/>
+                <w:bCs/>
+                <w:sz w:val="21"/>
+                <w:szCs w:val="21"/>
+              </w:rPr>
+              <w:t>.xlsx</w:t>
+            </w:r>
+          </w:p>
+        </w:tc>
+        <w:tc>
+          <w:tcPr>
+            <w:tcW w:w="0" w:type="auto"/>
+            <w:tcMar>
+              <w:top w:w="75" w:type="dxa"/>
+              <w:left w:w="150" w:type="dxa"/>
+              <w:bottom w:w="75" w:type="dxa"/>
+              <w:right w:w="150" w:type="dxa"/>
+            </w:tcMar>
+            <w:vAlign w:val="center"/>
+            <w:hideMark/>
+          </w:tcPr>
+          <w:p>
+            <w:pPr>
+              <w:spacing w:after="168" w:line="240" w:lineRule="auto"/>
+              <w:rPr>
+                <w:rFonts w:ascii="Segoe UI" w:eastAsia="Times New Roman" w:hAnsi="Segoe UI" w:cs="Segoe UI"/>
+                <w:sz w:val="21"/>
+                <w:szCs w:val="21"/>
+              </w:rPr>
+            </w:pPr>
+            <w:r>
+              <w:rPr>
+                <w:rFonts w:ascii="Segoe UI" w:eastAsia="Times New Roman" w:hAnsi="Segoe UI" w:cs="Segoe UI"/>
+                <w:sz w:val="21"/>
+                <w:szCs w:val="21"/>
+              </w:rPr>
+              <w:t>Summary of what the automation is entering (packages, choices, etc.) for the run.</w:t>
+            </w:r>
+          </w:p>
+        </w:tc>
+      </w:tr>
+    </w:tbl>
+    <w:p>
+      <w:pPr>
+        <w:spacing w:after="240" w:line="240" w:lineRule="auto"/>
+        <w:rPr>
+          <w:rFonts w:ascii="Segoe UI" w:eastAsia="Times New Roman" w:hAnsi="Segoe UI" w:cs="Segoe UI"/>
+          <w:sz w:val="21"/>
+          <w:szCs w:val="21"/>
+        </w:rPr>
+      </w:pPr>
+      <w:r>
+        <w:rPr>
+          <w:rFonts w:ascii="Segoe UI" w:eastAsia="Times New Roman" w:hAnsi="Segoe UI" w:cs="Segoe UI"/>
+          <w:sz w:val="21"/>
+          <w:szCs w:val="21"/>
+        </w:rPr>
+        <w:t>All report files are Excel (</w:t>
+      </w:r>
+      <w:r>
+        <w:rPr>
+          <w:rFonts w:ascii="Menlo" w:eastAsia="Times New Roman" w:hAnsi="Menlo" w:cs="Menlo"/>
+          <w:color w:val="88C0D0"/>
+          <w:sz w:val="21"/>
+          <w:szCs w:val="21"/>
+        </w:rPr>
+        <w:t>.xlsx</w:t>
+      </w:r>
+      <w:r>
+        <w:rPr>
+          <w:rFonts w:ascii="Segoe UI" w:eastAsia="Times New Roman" w:hAnsi="Segoe UI" w:cs="Segoe UI"/>
+          <w:sz w:val="21"/>
+          <w:szCs w:val="21"/>
+        </w:rPr>
+        <w:t>).</w:t>
+      </w:r>
+    </w:p>
+    <w:p>
+      <w:pPr>
+        <w:spacing w:after="0" w:line="240" w:lineRule="auto"/>
+        <w:rPr>
+          <w:rFonts w:ascii="Segoe UI" w:eastAsia="Times New Roman" w:hAnsi="Segoe UI" w:cs="Segoe UI"/>
+          <w:sz w:val="21"/>
+          <w:szCs w:val="21"/>
+        </w:rPr>
+      </w:pPr>
+      <w:r>
+        <w:rPr>
+          <w:rFonts w:ascii="Times New Roman" w:eastAsia="Times New Roman" w:hAnsi="Times New Roman" w:cs="Times New Roman"/>
+          <w:noProof/>
+          <w:sz w:val="24"/>
+          <w:szCs w:val="24"/>
+        </w:rPr>
+        <w:pict w14:anchorId="2744DB23">
+          <v:rect id="_x0000_i1025" alt="" style="width:468pt;height:.05pt;mso-width-percent:0;mso-height-percent:0;mso-width-percent:0;mso-height-percent:0" o:hralign="center" o:hrstd="t" o:hr="t" fillcolor="#a0a0a0" stroked="f"/>
+        </w:pict>
+      </w:r>
+    </w:p>
+    <w:p>
+      <w:pPr>
+        <w:spacing w:before="360" w:after="240" w:line="240" w:lineRule="auto"/>
+        <w:outlineLvl w:val="1"/>
+        <w:rPr>
+          <w:rFonts w:ascii="Segoe UI" w:eastAsia="Times New Roman" w:hAnsi="Segoe UI" w:cs="Segoe UI"/>
+          <w:b/>
+          <w:bCs/>
+          <w:sz w:val="36"/>
+          <w:szCs w:val="36"/>
+        </w:rPr>
+      </w:pPr>
+      <w:r>
+        <w:rPr>
+          <w:rFonts w:ascii="Segoe UI" w:eastAsia="Times New Roman" w:hAnsi="Segoe UI" w:cs="Segoe UI"/>
+          <w:b/>
+          <w:bCs/>
+          <w:sz w:val="36"/>
+          <w:szCs w:val="36"/>
+        </w:rPr>
+        <w:t>When the code is updated</w:t>
+      </w:r>
+    </w:p>
+    <w:p>
+      <w:pPr>
+        <w:spacing w:after="240" w:line="240" w:lineRule="auto"/>
+        <w:rPr>
+          <w:rFonts w:ascii="Segoe UI" w:eastAsia="Times New Roman" w:hAnsi="Segoe UI" w:cs="Segoe UI"/>
+          <w:sz w:val="21"/>
+          <w:szCs w:val="21"/>
+        </w:rPr>
+      </w:pPr>
+      <w:r>
+        <w:rPr>
+          <w:rFonts w:ascii="Segoe UI" w:eastAsia="Times New Roman" w:hAnsi="Segoe UI" w:cs="Segoe UI"/>
+          <w:sz w:val="21"/>
+          <w:szCs w:val="21"/>
+        </w:rPr>
+        <w:t>If the code is updated, get the latest version like this:</w:t>
+      </w:r>
+    </w:p>
+    <w:p>
+      <w:pPr>
         <w:numPr>
           <w:ilvl w:val="0"/>
-          <w:numId w:val="3"/>
+          <w:numId w:val="7"/>
         </w:numPr>
         <w:spacing w:before="100" w:beforeAutospacing="1" w:after="100" w:afterAutospacing="1" w:line="240" w:lineRule="auto"/>
         <w:rPr>
@@ -482,46 +1290,138 @@
       <w:r>
         <w:rPr>
           <w:rFonts w:ascii="Segoe UI" w:eastAsia="Times New Roman" w:hAnsi="Segoe UI" w:cs="Segoe UI"/>
+          <w:sz w:val="21"/>
+          <w:szCs w:val="21"/>
+        </w:rPr>
+        <w:t>Open </w:t>
+      </w:r>
+      <w:r>
+        <w:rPr>
+          <w:rFonts w:ascii="Segoe UI" w:eastAsia="Times New Roman" w:hAnsi="Segoe UI" w:cs="Segoe UI"/>
           <w:b/>
           <w:bCs/>
           <w:sz w:val="21"/>
           <w:szCs w:val="21"/>
         </w:rPr>
-        <w:t>Clicking the wrong spot</w:t>
-      </w:r>
-      <w:r>
-        <w:rPr>
-          <w:rFonts w:ascii="Segoe UI" w:eastAsia="Times New Roman" w:hAnsi="Segoe UI" w:cs="Segoe UI"/>
-          <w:sz w:val="21"/>
-          <w:szCs w:val="21"/>
-        </w:rPr>
-        <w:t>: The window moved. Run [</w:t>
-      </w:r>
-      <w:r>
-        <w:rPr>
-          <w:rFonts w:ascii="Segoe UI" w:eastAsia="Times New Roman" w:hAnsi="Segoe UI" w:cs="Segoe UI"/>
-          <w:i/>
-          <w:sz w:val="21"/>
-          <w:szCs w:val="21"/>
-        </w:rPr>
-        <w:t>Run_Schooldays_Automation_Yearbook_Photo_Choice.bat</w:t>
-      </w:r>
-      <w:r>
-        <w:rPr>
-          <w:rFonts w:ascii="Segoe UI" w:eastAsia="Times New Roman" w:hAnsi="Segoe UI" w:cs="Segoe UI"/>
-          <w:sz w:val="21"/>
-          <w:szCs w:val="21"/>
-        </w:rPr>
-        <w:t>] again.</w:t>
+        <w:t>Git Bash</w:t>
+      </w:r>
+      <w:r>
+        <w:rPr>
+          <w:rFonts w:ascii="Segoe UI" w:eastAsia="Times New Roman" w:hAnsi="Segoe UI" w:cs="Segoe UI"/>
+          <w:sz w:val="21"/>
+          <w:szCs w:val="21"/>
+        </w:rPr>
+        <w:t>.</w:t>
       </w:r>
     </w:p>
     <w:p>
       <w:pPr>
-        <w:rPr>
-          <w:rFonts w:hint="eastAsia"/>
-        </w:rPr>
-      </w:pPr>
+        <w:numPr>
+          <w:ilvl w:val="0"/>
+          <w:numId w:val="7"/>
+        </w:numPr>
+        <w:spacing w:before="100" w:beforeAutospacing="1" w:after="100" w:afterAutospacing="1" w:line="240" w:lineRule="auto"/>
+        <w:rPr>
+          <w:rFonts w:ascii="Segoe UI" w:eastAsia="Times New Roman" w:hAnsi="Segoe UI" w:cs="Segoe UI"/>
+          <w:sz w:val="21"/>
+          <w:szCs w:val="21"/>
+        </w:rPr>
+      </w:pPr>
+      <w:r>
+        <w:rPr>
+          <w:rFonts w:ascii="Segoe UI" w:eastAsia="Times New Roman" w:hAnsi="Segoe UI" w:cs="Segoe UI"/>
+          <w:sz w:val="21"/>
+          <w:szCs w:val="21"/>
+        </w:rPr>
+        <w:t>Go to this project folder (the one that contains </w:t>
+      </w:r>
+      <w:r>
+        <w:rPr>
+          <w:rFonts w:ascii="Menlo" w:eastAsia="Times New Roman" w:hAnsi="Menlo" w:cs="Menlo"/>
+          <w:color w:val="88C0D0"/>
+          <w:sz w:val="21"/>
+          <w:szCs w:val="21"/>
+        </w:rPr>
+        <w:t>yearbook-choice</w:t>
+      </w:r>
+      <w:r>
+        <w:rPr>
+          <w:rFonts w:ascii="Segoe UI" w:eastAsia="Times New Roman" w:hAnsi="Segoe UI" w:cs="Segoe UI"/>
+          <w:sz w:val="21"/>
+          <w:szCs w:val="21"/>
+        </w:rPr>
+        <w:t> and </w:t>
+      </w:r>
+      <w:r>
+        <w:rPr>
+          <w:rFonts w:ascii="Menlo" w:eastAsia="Times New Roman" w:hAnsi="Menlo" w:cs="Menlo"/>
+          <w:color w:val="88C0D0"/>
+          <w:sz w:val="21"/>
+          <w:szCs w:val="21"/>
+        </w:rPr>
+        <w:t>package-choice</w:t>
+      </w:r>
+      <w:r>
+        <w:rPr>
+          <w:rFonts w:ascii="Segoe UI" w:eastAsia="Times New Roman" w:hAnsi="Segoe UI" w:cs="Segoe UI"/>
+          <w:sz w:val="21"/>
+          <w:szCs w:val="21"/>
+        </w:rPr>
+        <w:t>).</w:t>
+      </w:r>
     </w:p>
+    <w:p>
+      <w:pPr>
+        <w:numPr>
+          <w:ilvl w:val="0"/>
+          <w:numId w:val="7"/>
+        </w:numPr>
+        <w:spacing w:before="100" w:beforeAutospacing="1" w:after="100" w:afterAutospacing="1" w:line="240" w:lineRule="auto"/>
+        <w:rPr>
+          <w:rFonts w:ascii="Segoe UI" w:eastAsia="Times New Roman" w:hAnsi="Segoe UI" w:cs="Segoe UI"/>
+          <w:sz w:val="21"/>
+          <w:szCs w:val="21"/>
+        </w:rPr>
+      </w:pPr>
+      <w:r>
+        <w:rPr>
+          <w:rFonts w:ascii="Segoe UI" w:eastAsia="Times New Roman" w:hAnsi="Segoe UI" w:cs="Segoe UI"/>
+          <w:sz w:val="21"/>
+          <w:szCs w:val="21"/>
+        </w:rPr>
+        <w:t>Run: </w:t>
+      </w:r>
+      <w:r>
+        <w:rPr>
+          <w:rFonts w:ascii="Menlo" w:eastAsia="Times New Roman" w:hAnsi="Menlo" w:cs="Menlo"/>
+          <w:b/>
+          <w:bCs/>
+          <w:color w:val="88C0D0"/>
+          <w:sz w:val="21"/>
+          <w:szCs w:val="21"/>
+        </w:rPr>
+        <w:t>git pull</w:t>
+      </w:r>
+    </w:p>
+    <w:p>
+      <w:pPr>
+        <w:spacing w:after="240" w:line="240" w:lineRule="auto"/>
+        <w:rPr>
+          <w:rFonts w:ascii="Segoe UI" w:eastAsia="Times New Roman" w:hAnsi="Segoe UI" w:cs="Segoe UI"/>
+          <w:sz w:val="21"/>
+          <w:szCs w:val="21"/>
+        </w:rPr>
+      </w:pPr>
+      <w:r>
+        <w:rPr>
+          <w:rFonts w:ascii="Segoe UI" w:eastAsia="Times New Roman" w:hAnsi="Segoe UI" w:cs="Segoe UI"/>
+          <w:sz w:val="21"/>
+          <w:szCs w:val="21"/>
+        </w:rPr>
+        <w:t>That’s it. You’ll then have the latest instructions and fixes.</w:t>
+      </w:r>
+    </w:p>
+    <w:p/>
     <w:sectPr>
       <w:pgSz w:w="12240" w:h="15840"/>
       <w:pgMar w:top="1440" w:right="1440" w:bottom="1440" w:left="1440" w:header="720" w:footer="720" w:gutter="0"/>
@@ -533,8 +1433,121 @@
 </file>
 
 <file path=word/numbering.xml><?xml version="1.0" encoding="utf-8"?>
-<w:numbering xmlns:ve="http://schemas.openxmlformats.org/markup-compatibility/2006" xmlns:o="urn:schemas-microsoft-com:office:office" xmlns:r="http://schemas.openxmlformats.org/officeDocument/2006/relationships" xmlns:m="http://schemas.openxmlformats.org/officeDocument/2006/math" xmlns:v="urn:schemas-microsoft-com:vml" xmlns:wp="http://schemas.openxmlformats.org/drawingml/2006/wordprocessingDrawing" xmlns:w10="urn:schemas-microsoft-com:office:word" xmlns:w="http://schemas.openxmlformats.org/wordprocessingml/2006/main" xmlns:wne="http://schemas.microsoft.com/office/word/2006/wordml">
-  <w:abstractNum w:abstractNumId="0">
+<w:numbering xmlns:wpc="http://schemas.microsoft.com/office/word/2010/wordprocessingCanvas" xmlns:cx="http://schemas.microsoft.com/office/drawing/2014/chartex" xmlns:cx1="http://schemas.microsoft.com/office/drawing/2015/9/8/chartex" xmlns:cx2="http://schemas.microsoft.com/office/drawing/2015/10/21/chartex" xmlns:cx3="http://schemas.microsoft.com/office/drawing/2016/5/9/chartex" xmlns:cx4="http://schemas.microsoft.com/office/drawing/2016/5/10/chartex" xmlns:cx5="http://schemas.microsoft.com/office/drawing/2016/5/11/chartex" xmlns:cx6="http://schemas.microsoft.com/office/drawing/2016/5/12/chartex" xmlns:cx7="http://schemas.microsoft.com/office/drawing/2016/5/13/chartex" xmlns:cx8="http://schemas.microsoft.com/office/drawing/2016/5/14/chartex" xmlns:mc="http://schemas.openxmlformats.org/markup-compatibility/2006" xmlns:aink="http://schemas.microsoft.com/office/drawing/2016/ink" xmlns:am3d="http://schemas.microsoft.com/office/drawing/2017/model3d" xmlns:o="urn:schemas-microsoft-com:office:office" xmlns:oel="http://schemas.microsoft.com/office/2019/extlst" xmlns:r="http://schemas.openxmlformats.org/officeDocument/2006/relationships" xmlns:m="http://schemas.openxmlformats.org/officeDocument/2006/math" xmlns:v="urn:schemas-microsoft-com:vml" xmlns:wp14="http://schemas.microsoft.com/office/word/2010/wordprocessingDrawing" xmlns:wp="http://schemas.openxmlformats.org/drawingml/2006/wordprocessingDrawing" xmlns:w10="urn:schemas-microsoft-com:office:word" xmlns:w="http://schemas.openxmlformats.org/wordprocessingml/2006/main" xmlns:w14="http://schemas.microsoft.com/office/word/2010/wordml" xmlns:w15="http://schemas.microsoft.com/office/word/2012/wordml" xmlns:w16cex="http://schemas.microsoft.com/office/word/2018/wordml/cex" xmlns:w16cid="http://schemas.microsoft.com/office/word/2016/wordml/cid" xmlns:w16="http://schemas.microsoft.com/office/word/2018/wordml" xmlns:w16du="http://schemas.microsoft.com/office/word/2023/wordml/word16du" xmlns:w16sdtdh="http://schemas.microsoft.com/office/word/2020/wordml/sdtdatahash" xmlns:w16sdtfl="http://schemas.microsoft.com/office/word/2024/wordml/sdtformatlock" xmlns:w16se="http://schemas.microsoft.com/office/word/2015/wordml/symex" xmlns:wpg="http://schemas.microsoft.com/office/word/2010/wordprocessingGroup" xmlns:wpi="http://schemas.microsoft.com/office/word/2010/wordprocessingInk" xmlns:wne="http://schemas.microsoft.com/office/word/2006/wordml" xmlns:wps="http://schemas.microsoft.com/office/word/2010/wordprocessingShape" mc:Ignorable="w14 w15 w16se w16cid w16 w16cex w16sdtdh w16sdtfl w16du wp14">
+  <w:abstractNum w:abstractNumId="0" w15:restartNumberingAfterBreak="0">
+    <w:nsid w:val="18E07490"/>
+    <w:multiLevelType w:val="multilevel"/>
+    <w:tmpl w:val="3076A5BA"/>
+    <w:lvl w:ilvl="0">
+      <w:start w:val="1"/>
+      <w:numFmt w:val="decimal"/>
+      <w:lvlText w:val="%1."/>
+      <w:lvlJc w:val="left"/>
+      <w:pPr>
+        <w:tabs>
+          <w:tab w:val="num" w:pos="720"/>
+        </w:tabs>
+        <w:ind w:left="720" w:hanging="360"/>
+      </w:pPr>
+    </w:lvl>
+    <w:lvl w:ilvl="1" w:tentative="1">
+      <w:start w:val="1"/>
+      <w:numFmt w:val="decimal"/>
+      <w:lvlText w:val="%2."/>
+      <w:lvlJc w:val="left"/>
+      <w:pPr>
+        <w:tabs>
+          <w:tab w:val="num" w:pos="1440"/>
+        </w:tabs>
+        <w:ind w:left="1440" w:hanging="360"/>
+      </w:pPr>
+    </w:lvl>
+    <w:lvl w:ilvl="2" w:tentative="1">
+      <w:start w:val="1"/>
+      <w:numFmt w:val="decimal"/>
+      <w:lvlText w:val="%3."/>
+      <w:lvlJc w:val="left"/>
+      <w:pPr>
+        <w:tabs>
+          <w:tab w:val="num" w:pos="2160"/>
+        </w:tabs>
+        <w:ind w:left="2160" w:hanging="360"/>
+      </w:pPr>
+    </w:lvl>
+    <w:lvl w:ilvl="3" w:tentative="1">
+      <w:start w:val="1"/>
+      <w:numFmt w:val="decimal"/>
+      <w:lvlText w:val="%4."/>
+      <w:lvlJc w:val="left"/>
+      <w:pPr>
+        <w:tabs>
+          <w:tab w:val="num" w:pos="2880"/>
+        </w:tabs>
+        <w:ind w:left="2880" w:hanging="360"/>
+      </w:pPr>
+    </w:lvl>
+    <w:lvl w:ilvl="4" w:tentative="1">
+      <w:start w:val="1"/>
+      <w:numFmt w:val="decimal"/>
+      <w:lvlText w:val="%5."/>
+      <w:lvlJc w:val="left"/>
+      <w:pPr>
+        <w:tabs>
+          <w:tab w:val="num" w:pos="3600"/>
+        </w:tabs>
+        <w:ind w:left="3600" w:hanging="360"/>
+      </w:pPr>
+    </w:lvl>
+    <w:lvl w:ilvl="5" w:tentative="1">
+      <w:start w:val="1"/>
+      <w:numFmt w:val="decimal"/>
+      <w:lvlText w:val="%6."/>
+      <w:lvlJc w:val="left"/>
+      <w:pPr>
+        <w:tabs>
+          <w:tab w:val="num" w:pos="4320"/>
+        </w:tabs>
+        <w:ind w:left="4320" w:hanging="360"/>
+      </w:pPr>
+    </w:lvl>
+    <w:lvl w:ilvl="6" w:tentative="1">
+      <w:start w:val="1"/>
+      <w:numFmt w:val="decimal"/>
+      <w:lvlText w:val="%7."/>
+      <w:lvlJc w:val="left"/>
+      <w:pPr>
+        <w:tabs>
+          <w:tab w:val="num" w:pos="5040"/>
+        </w:tabs>
+        <w:ind w:left="5040" w:hanging="360"/>
+      </w:pPr>
+    </w:lvl>
+    <w:lvl w:ilvl="7" w:tentative="1">
+      <w:start w:val="1"/>
+      <w:numFmt w:val="decimal"/>
+      <w:lvlText w:val="%8."/>
+      <w:lvlJc w:val="left"/>
+      <w:pPr>
+        <w:tabs>
+          <w:tab w:val="num" w:pos="5760"/>
+        </w:tabs>
+        <w:ind w:left="5760" w:hanging="360"/>
+      </w:pPr>
+    </w:lvl>
+    <w:lvl w:ilvl="8" w:tentative="1">
+      <w:start w:val="1"/>
+      <w:numFmt w:val="decimal"/>
+      <w:lvlText w:val="%9."/>
+      <w:lvlJc w:val="left"/>
+      <w:pPr>
+        <w:tabs>
+          <w:tab w:val="num" w:pos="6480"/>
+        </w:tabs>
+        <w:ind w:left="6480" w:hanging="360"/>
+      </w:pPr>
+    </w:lvl>
+  </w:abstractNum>
+  <w:abstractNum w:abstractNumId="1" w15:restartNumberingAfterBreak="0">
     <w:nsid w:val="27D55A75"/>
     <w:multiLevelType w:val="multilevel"/>
     <w:tmpl w:val="F3B027F0"/>
@@ -683,7 +1696,382 @@
       </w:rPr>
     </w:lvl>
   </w:abstractNum>
-  <w:abstractNum w:abstractNumId="1">
+  <w:abstractNum w:abstractNumId="2" w15:restartNumberingAfterBreak="0">
+    <w:nsid w:val="37481690"/>
+    <w:multiLevelType w:val="multilevel"/>
+    <w:tmpl w:val="B0D693F8"/>
+    <w:lvl w:ilvl="0">
+      <w:start w:val="1"/>
+      <w:numFmt w:val="decimal"/>
+      <w:lvlText w:val="%1."/>
+      <w:lvlJc w:val="left"/>
+      <w:pPr>
+        <w:tabs>
+          <w:tab w:val="num" w:pos="720"/>
+        </w:tabs>
+        <w:ind w:left="720" w:hanging="360"/>
+      </w:pPr>
+    </w:lvl>
+    <w:lvl w:ilvl="1" w:tentative="1">
+      <w:start w:val="1"/>
+      <w:numFmt w:val="decimal"/>
+      <w:lvlText w:val="%2."/>
+      <w:lvlJc w:val="left"/>
+      <w:pPr>
+        <w:tabs>
+          <w:tab w:val="num" w:pos="1440"/>
+        </w:tabs>
+        <w:ind w:left="1440" w:hanging="360"/>
+      </w:pPr>
+    </w:lvl>
+    <w:lvl w:ilvl="2" w:tentative="1">
+      <w:start w:val="1"/>
+      <w:numFmt w:val="decimal"/>
+      <w:lvlText w:val="%3."/>
+      <w:lvlJc w:val="left"/>
+      <w:pPr>
+        <w:tabs>
+          <w:tab w:val="num" w:pos="2160"/>
+        </w:tabs>
+        <w:ind w:left="2160" w:hanging="360"/>
+      </w:pPr>
+    </w:lvl>
+    <w:lvl w:ilvl="3" w:tentative="1">
+      <w:start w:val="1"/>
+      <w:numFmt w:val="decimal"/>
+      <w:lvlText w:val="%4."/>
+      <w:lvlJc w:val="left"/>
+      <w:pPr>
+        <w:tabs>
+          <w:tab w:val="num" w:pos="2880"/>
+        </w:tabs>
+        <w:ind w:left="2880" w:hanging="360"/>
+      </w:pPr>
+    </w:lvl>
+    <w:lvl w:ilvl="4" w:tentative="1">
+      <w:start w:val="1"/>
+      <w:numFmt w:val="decimal"/>
+      <w:lvlText w:val="%5."/>
+      <w:lvlJc w:val="left"/>
+      <w:pPr>
+        <w:tabs>
+          <w:tab w:val="num" w:pos="3600"/>
+        </w:tabs>
+        <w:ind w:left="3600" w:hanging="360"/>
+      </w:pPr>
+    </w:lvl>
+    <w:lvl w:ilvl="5" w:tentative="1">
+      <w:start w:val="1"/>
+      <w:numFmt w:val="decimal"/>
+      <w:lvlText w:val="%6."/>
+      <w:lvlJc w:val="left"/>
+      <w:pPr>
+        <w:tabs>
+          <w:tab w:val="num" w:pos="4320"/>
+        </w:tabs>
+        <w:ind w:left="4320" w:hanging="360"/>
+      </w:pPr>
+    </w:lvl>
+    <w:lvl w:ilvl="6" w:tentative="1">
+      <w:start w:val="1"/>
+      <w:numFmt w:val="decimal"/>
+      <w:lvlText w:val="%7."/>
+      <w:lvlJc w:val="left"/>
+      <w:pPr>
+        <w:tabs>
+          <w:tab w:val="num" w:pos="5040"/>
+        </w:tabs>
+        <w:ind w:left="5040" w:hanging="360"/>
+      </w:pPr>
+    </w:lvl>
+    <w:lvl w:ilvl="7" w:tentative="1">
+      <w:start w:val="1"/>
+      <w:numFmt w:val="decimal"/>
+      <w:lvlText w:val="%8."/>
+      <w:lvlJc w:val="left"/>
+      <w:pPr>
+        <w:tabs>
+          <w:tab w:val="num" w:pos="5760"/>
+        </w:tabs>
+        <w:ind w:left="5760" w:hanging="360"/>
+      </w:pPr>
+    </w:lvl>
+    <w:lvl w:ilvl="8" w:tentative="1">
+      <w:start w:val="1"/>
+      <w:numFmt w:val="decimal"/>
+      <w:lvlText w:val="%9."/>
+      <w:lvlJc w:val="left"/>
+      <w:pPr>
+        <w:tabs>
+          <w:tab w:val="num" w:pos="6480"/>
+        </w:tabs>
+        <w:ind w:left="6480" w:hanging="360"/>
+      </w:pPr>
+    </w:lvl>
+  </w:abstractNum>
+  <w:abstractNum w:abstractNumId="3" w15:restartNumberingAfterBreak="0">
+    <w:nsid w:val="4C9B12E8"/>
+    <w:multiLevelType w:val="multilevel"/>
+    <w:tmpl w:val="0B7E6290"/>
+    <w:lvl w:ilvl="0">
+      <w:start w:val="1"/>
+      <w:numFmt w:val="decimal"/>
+      <w:lvlText w:val="%1."/>
+      <w:lvlJc w:val="left"/>
+      <w:pPr>
+        <w:tabs>
+          <w:tab w:val="num" w:pos="720"/>
+        </w:tabs>
+        <w:ind w:left="720" w:hanging="360"/>
+      </w:pPr>
+    </w:lvl>
+    <w:lvl w:ilvl="1" w:tentative="1">
+      <w:start w:val="1"/>
+      <w:numFmt w:val="decimal"/>
+      <w:lvlText w:val="%2."/>
+      <w:lvlJc w:val="left"/>
+      <w:pPr>
+        <w:tabs>
+          <w:tab w:val="num" w:pos="1440"/>
+        </w:tabs>
+        <w:ind w:left="1440" w:hanging="360"/>
+      </w:pPr>
+    </w:lvl>
+    <w:lvl w:ilvl="2" w:tentative="1">
+      <w:start w:val="1"/>
+      <w:numFmt w:val="decimal"/>
+      <w:lvlText w:val="%3."/>
+      <w:lvlJc w:val="left"/>
+      <w:pPr>
+        <w:tabs>
+          <w:tab w:val="num" w:pos="2160"/>
+        </w:tabs>
+        <w:ind w:left="2160" w:hanging="360"/>
+      </w:pPr>
+    </w:lvl>
+    <w:lvl w:ilvl="3" w:tentative="1">
+      <w:start w:val="1"/>
+      <w:numFmt w:val="decimal"/>
+      <w:lvlText w:val="%4."/>
+      <w:lvlJc w:val="left"/>
+      <w:pPr>
+        <w:tabs>
+          <w:tab w:val="num" w:pos="2880"/>
+        </w:tabs>
+        <w:ind w:left="2880" w:hanging="360"/>
+      </w:pPr>
+    </w:lvl>
+    <w:lvl w:ilvl="4" w:tentative="1">
+      <w:start w:val="1"/>
+      <w:numFmt w:val="decimal"/>
+      <w:lvlText w:val="%5."/>
+      <w:lvlJc w:val="left"/>
+      <w:pPr>
+        <w:tabs>
+          <w:tab w:val="num" w:pos="3600"/>
+        </w:tabs>
+        <w:ind w:left="3600" w:hanging="360"/>
+      </w:pPr>
+    </w:lvl>
+    <w:lvl w:ilvl="5" w:tentative="1">
+      <w:start w:val="1"/>
+      <w:numFmt w:val="decimal"/>
+      <w:lvlText w:val="%6."/>
+      <w:lvlJc w:val="left"/>
+      <w:pPr>
+        <w:tabs>
+          <w:tab w:val="num" w:pos="4320"/>
+        </w:tabs>
+        <w:ind w:left="4320" w:hanging="360"/>
+      </w:pPr>
+    </w:lvl>
+    <w:lvl w:ilvl="6" w:tentative="1">
+      <w:start w:val="1"/>
+      <w:numFmt w:val="decimal"/>
+      <w:lvlText w:val="%7."/>
+      <w:lvlJc w:val="left"/>
+      <w:pPr>
+        <w:tabs>
+          <w:tab w:val="num" w:pos="5040"/>
+        </w:tabs>
+        <w:ind w:left="5040" w:hanging="360"/>
+      </w:pPr>
+    </w:lvl>
+    <w:lvl w:ilvl="7" w:tentative="1">
+      <w:start w:val="1"/>
+      <w:numFmt w:val="decimal"/>
+      <w:lvlText w:val="%8."/>
+      <w:lvlJc w:val="left"/>
+      <w:pPr>
+        <w:tabs>
+          <w:tab w:val="num" w:pos="5760"/>
+        </w:tabs>
+        <w:ind w:left="5760" w:hanging="360"/>
+      </w:pPr>
+    </w:lvl>
+    <w:lvl w:ilvl="8" w:tentative="1">
+      <w:start w:val="1"/>
+      <w:numFmt w:val="decimal"/>
+      <w:lvlText w:val="%9."/>
+      <w:lvlJc w:val="left"/>
+      <w:pPr>
+        <w:tabs>
+          <w:tab w:val="num" w:pos="6480"/>
+        </w:tabs>
+        <w:ind w:left="6480" w:hanging="360"/>
+      </w:pPr>
+    </w:lvl>
+  </w:abstractNum>
+  <w:abstractNum w:abstractNumId="4" w15:restartNumberingAfterBreak="0">
+    <w:nsid w:val="4DF20594"/>
+    <w:multiLevelType w:val="multilevel"/>
+    <w:tmpl w:val="583EA608"/>
+    <w:lvl w:ilvl="0">
+      <w:start w:val="1"/>
+      <w:numFmt w:val="bullet"/>
+      <w:lvlText w:val=""/>
+      <w:lvlJc w:val="left"/>
+      <w:pPr>
+        <w:tabs>
+          <w:tab w:val="num" w:pos="720"/>
+        </w:tabs>
+        <w:ind w:left="720" w:hanging="360"/>
+      </w:pPr>
+      <w:rPr>
+        <w:rFonts w:ascii="Symbol" w:hAnsi="Symbol" w:hint="default"/>
+        <w:sz w:val="20"/>
+      </w:rPr>
+    </w:lvl>
+    <w:lvl w:ilvl="1" w:tentative="1">
+      <w:start w:val="1"/>
+      <w:numFmt w:val="bullet"/>
+      <w:lvlText w:val="o"/>
+      <w:lvlJc w:val="left"/>
+      <w:pPr>
+        <w:tabs>
+          <w:tab w:val="num" w:pos="1440"/>
+        </w:tabs>
+        <w:ind w:left="1440" w:hanging="360"/>
+      </w:pPr>
+      <w:rPr>
+        <w:rFonts w:ascii="Courier New" w:hAnsi="Courier New" w:hint="default"/>
+        <w:sz w:val="20"/>
+      </w:rPr>
+    </w:lvl>
+    <w:lvl w:ilvl="2" w:tentative="1">
+      <w:start w:val="1"/>
+      <w:numFmt w:val="bullet"/>
+      <w:lvlText w:val=""/>
+      <w:lvlJc w:val="left"/>
+      <w:pPr>
+        <w:tabs>
+          <w:tab w:val="num" w:pos="2160"/>
+        </w:tabs>
+        <w:ind w:left="2160" w:hanging="360"/>
+      </w:pPr>
+      <w:rPr>
+        <w:rFonts w:ascii="Wingdings" w:hAnsi="Wingdings" w:hint="default"/>
+        <w:sz w:val="20"/>
+      </w:rPr>
+    </w:lvl>
+    <w:lvl w:ilvl="3" w:tentative="1">
+      <w:start w:val="1"/>
+      <w:numFmt w:val="bullet"/>
+      <w:lvlText w:val=""/>
+      <w:lvlJc w:val="left"/>
+      <w:pPr>
+        <w:tabs>
+          <w:tab w:val="num" w:pos="2880"/>
+        </w:tabs>
+        <w:ind w:left="2880" w:hanging="360"/>
+      </w:pPr>
+      <w:rPr>
+        <w:rFonts w:ascii="Wingdings" w:hAnsi="Wingdings" w:hint="default"/>
+        <w:sz w:val="20"/>
+      </w:rPr>
+    </w:lvl>
+    <w:lvl w:ilvl="4" w:tentative="1">
+      <w:start w:val="1"/>
+      <w:numFmt w:val="bullet"/>
+      <w:lvlText w:val=""/>
+      <w:lvlJc w:val="left"/>
+      <w:pPr>
+        <w:tabs>
+          <w:tab w:val="num" w:pos="3600"/>
+        </w:tabs>
+        <w:ind w:left="3600" w:hanging="360"/>
+      </w:pPr>
+      <w:rPr>
+        <w:rFonts w:ascii="Wingdings" w:hAnsi="Wingdings" w:hint="default"/>
+        <w:sz w:val="20"/>
+      </w:rPr>
+    </w:lvl>
+    <w:lvl w:ilvl="5" w:tentative="1">
+      <w:start w:val="1"/>
+      <w:numFmt w:val="bullet"/>
+      <w:lvlText w:val=""/>
+      <w:lvlJc w:val="left"/>
+      <w:pPr>
+        <w:tabs>
+          <w:tab w:val="num" w:pos="4320"/>
+        </w:tabs>
+        <w:ind w:left="4320" w:hanging="360"/>
+      </w:pPr>
+      <w:rPr>
+        <w:rFonts w:ascii="Wingdings" w:hAnsi="Wingdings" w:hint="default"/>
+        <w:sz w:val="20"/>
+      </w:rPr>
+    </w:lvl>
+    <w:lvl w:ilvl="6" w:tentative="1">
+      <w:start w:val="1"/>
+      <w:numFmt w:val="bullet"/>
+      <w:lvlText w:val=""/>
+      <w:lvlJc w:val="left"/>
+      <w:pPr>
+        <w:tabs>
+          <w:tab w:val="num" w:pos="5040"/>
+        </w:tabs>
+        <w:ind w:left="5040" w:hanging="360"/>
+      </w:pPr>
+      <w:rPr>
+        <w:rFonts w:ascii="Wingdings" w:hAnsi="Wingdings" w:hint="default"/>
+        <w:sz w:val="20"/>
+      </w:rPr>
+    </w:lvl>
+    <w:lvl w:ilvl="7" w:tentative="1">
+      <w:start w:val="1"/>
+      <w:numFmt w:val="bullet"/>
+      <w:lvlText w:val=""/>
+      <w:lvlJc w:val="left"/>
+      <w:pPr>
+        <w:tabs>
+          <w:tab w:val="num" w:pos="5760"/>
+        </w:tabs>
+        <w:ind w:left="5760" w:hanging="360"/>
+      </w:pPr>
+      <w:rPr>
+        <w:rFonts w:ascii="Wingdings" w:hAnsi="Wingdings" w:hint="default"/>
+        <w:sz w:val="20"/>
+      </w:rPr>
+    </w:lvl>
+    <w:lvl w:ilvl="8" w:tentative="1">
+      <w:start w:val="1"/>
+      <w:numFmt w:val="bullet"/>
+      <w:lvlText w:val=""/>
+      <w:lvlJc w:val="left"/>
+      <w:pPr>
+        <w:tabs>
+          <w:tab w:val="num" w:pos="6480"/>
+        </w:tabs>
+        <w:ind w:left="6480" w:hanging="360"/>
+      </w:pPr>
+      <w:rPr>
+        <w:rFonts w:ascii="Wingdings" w:hAnsi="Wingdings" w:hint="default"/>
+        <w:sz w:val="20"/>
+      </w:rPr>
+    </w:lvl>
+  </w:abstractNum>
+  <w:abstractNum w:abstractNumId="5" w15:restartNumberingAfterBreak="0">
     <w:nsid w:val="51712774"/>
     <w:multiLevelType w:val="multilevel"/>
     <w:tmpl w:val="D22EEE48"/>
@@ -800,7 +2188,7 @@
       </w:pPr>
     </w:lvl>
   </w:abstractNum>
-  <w:abstractNum w:abstractNumId="2">
+  <w:abstractNum w:abstractNumId="6" w15:restartNumberingAfterBreak="0">
     <w:nsid w:val="706A5C9E"/>
     <w:multiLevelType w:val="multilevel"/>
     <w:tmpl w:val="B14C4062"/>
@@ -913,20 +2301,32 @@
       </w:pPr>
     </w:lvl>
   </w:abstractNum>
-  <w:num w:numId="1">
+  <w:num w:numId="1" w16cid:durableId="1417432510">
+    <w:abstractNumId w:val="5"/>
+  </w:num>
+  <w:num w:numId="2" w16cid:durableId="2127849001">
+    <w:abstractNumId w:val="6"/>
+  </w:num>
+  <w:num w:numId="3" w16cid:durableId="78331209">
     <w:abstractNumId w:val="1"/>
   </w:num>
-  <w:num w:numId="2">
+  <w:num w:numId="4" w16cid:durableId="322318724">
+    <w:abstractNumId w:val="4"/>
+  </w:num>
+  <w:num w:numId="5" w16cid:durableId="1579290826">
+    <w:abstractNumId w:val="3"/>
+  </w:num>
+  <w:num w:numId="6" w16cid:durableId="163860698">
     <w:abstractNumId w:val="2"/>
   </w:num>
-  <w:num w:numId="3">
+  <w:num w:numId="7" w16cid:durableId="859707016">
     <w:abstractNumId w:val="0"/>
   </w:num>
 </w:numbering>
 </file>
 
 <file path=word/styles.xml><?xml version="1.0" encoding="utf-8"?>
-<w:styles xmlns:r="http://schemas.openxmlformats.org/officeDocument/2006/relationships" xmlns:w="http://schemas.openxmlformats.org/wordprocessingml/2006/main">
+<w:styles xmlns:mc="http://schemas.openxmlformats.org/markup-compatibility/2006" xmlns:r="http://schemas.openxmlformats.org/officeDocument/2006/relationships" xmlns:w="http://schemas.openxmlformats.org/wordprocessingml/2006/main" xmlns:w14="http://schemas.microsoft.com/office/word/2010/wordml" xmlns:w15="http://schemas.microsoft.com/office/word/2012/wordml" xmlns:w16cex="http://schemas.microsoft.com/office/word/2018/wordml/cex" xmlns:w16cid="http://schemas.microsoft.com/office/word/2016/wordml/cid" xmlns:w16="http://schemas.microsoft.com/office/word/2018/wordml" xmlns:w16du="http://schemas.microsoft.com/office/word/2023/wordml/word16du" xmlns:w16sdtdh="http://schemas.microsoft.com/office/word/2020/wordml/sdtdatahash" xmlns:w16sdtfl="http://schemas.microsoft.com/office/word/2024/wordml/sdtformatlock" xmlns:w16se="http://schemas.microsoft.com/office/word/2015/wordml/symex" mc:Ignorable="w14 w15 w16se w16cid w16 w16cex w16sdtdh w16sdtfl w16du">
   <w:docDefaults>
     <w:rPrDefault>
       <w:rPr>
@@ -942,144 +2342,383 @@
       </w:pPr>
     </w:pPrDefault>
   </w:docDefaults>
-  <w:latentStyles w:defLockedState="0" w:defUIPriority="99" w:defSemiHidden="1" w:defUnhideWhenUsed="1" w:defQFormat="0" w:count="267">
-    <w:lsdException w:name="Normal" w:semiHidden="0" w:uiPriority="0" w:unhideWhenUsed="0" w:qFormat="1"/>
-    <w:lsdException w:name="heading 1" w:semiHidden="0" w:uiPriority="9" w:unhideWhenUsed="0" w:qFormat="1"/>
-    <w:lsdException w:name="heading 2" w:uiPriority="9" w:qFormat="1"/>
-    <w:lsdException w:name="heading 3" w:uiPriority="9" w:qFormat="1"/>
-    <w:lsdException w:name="heading 4" w:uiPriority="9" w:qFormat="1"/>
-    <w:lsdException w:name="heading 5" w:uiPriority="9" w:qFormat="1"/>
-    <w:lsdException w:name="heading 6" w:uiPriority="9" w:qFormat="1"/>
-    <w:lsdException w:name="heading 7" w:uiPriority="9" w:qFormat="1"/>
-    <w:lsdException w:name="heading 8" w:uiPriority="9" w:qFormat="1"/>
-    <w:lsdException w:name="heading 9" w:uiPriority="9" w:qFormat="1"/>
-    <w:lsdException w:name="toc 1" w:uiPriority="39"/>
-    <w:lsdException w:name="toc 2" w:uiPriority="39"/>
-    <w:lsdException w:name="toc 3" w:uiPriority="39"/>
-    <w:lsdException w:name="toc 4" w:uiPriority="39"/>
-    <w:lsdException w:name="toc 5" w:uiPriority="39"/>
-    <w:lsdException w:name="toc 6" w:uiPriority="39"/>
-    <w:lsdException w:name="toc 7" w:uiPriority="39"/>
-    <w:lsdException w:name="toc 8" w:uiPriority="39"/>
-    <w:lsdException w:name="toc 9" w:uiPriority="39"/>
-    <w:lsdException w:name="caption" w:uiPriority="35" w:qFormat="1"/>
-    <w:lsdException w:name="Title" w:semiHidden="0" w:uiPriority="10" w:unhideWhenUsed="0" w:qFormat="1"/>
-    <w:lsdException w:name="Default Paragraph Font" w:uiPriority="1"/>
-    <w:lsdException w:name="Subtitle" w:semiHidden="0" w:uiPriority="11" w:unhideWhenUsed="0" w:qFormat="1"/>
-    <w:lsdException w:name="Strong" w:semiHidden="0" w:uiPriority="22" w:unhideWhenUsed="0" w:qFormat="1"/>
-    <w:lsdException w:name="Emphasis" w:semiHidden="0" w:uiPriority="20" w:unhideWhenUsed="0" w:qFormat="1"/>
-    <w:lsdException w:name="Table Grid" w:semiHidden="0" w:uiPriority="59" w:unhideWhenUsed="0"/>
-    <w:lsdException w:name="Placeholder Text" w:unhideWhenUsed="0"/>
-    <w:lsdException w:name="No Spacing" w:semiHidden="0" w:uiPriority="1" w:unhideWhenUsed="0" w:qFormat="1"/>
-    <w:lsdException w:name="Light Shading" w:semiHidden="0" w:uiPriority="60" w:unhideWhenUsed="0"/>
-    <w:lsdException w:name="Light List" w:semiHidden="0" w:uiPriority="61" w:unhideWhenUsed="0"/>
-    <w:lsdException w:name="Light Grid" w:semiHidden="0" w:uiPriority="62" w:unhideWhenUsed="0"/>
-    <w:lsdException w:name="Medium Shading 1" w:semiHidden="0" w:uiPriority="63" w:unhideWhenUsed="0"/>
-    <w:lsdException w:name="Medium Shading 2" w:semiHidden="0" w:uiPriority="64" w:unhideWhenUsed="0"/>
-    <w:lsdException w:name="Medium List 1" w:semiHidden="0" w:uiPriority="65" w:unhideWhenUsed="0"/>
-    <w:lsdException w:name="Medium List 2" w:semiHidden="0" w:uiPriority="66" w:unhideWhenUsed="0"/>
-    <w:lsdException w:name="Medium Grid 1" w:semiHidden="0" w:uiPriority="67" w:unhideWhenUsed="0"/>
-    <w:lsdException w:name="Medium Grid 2" w:semiHidden="0" w:uiPriority="68" w:unhideWhenUsed="0"/>
-    <w:lsdException w:name="Medium Grid 3" w:semiHidden="0" w:uiPriority="69" w:unhideWhenUsed="0"/>
-    <w:lsdException w:name="Dark List" w:semiHidden="0" w:uiPriority="70" w:unhideWhenUsed="0"/>
-    <w:lsdException w:name="Colorful Shading" w:semiHidden="0" w:uiPriority="71" w:unhideWhenUsed="0"/>
-    <w:lsdException w:name="Colorful List" w:semiHidden="0" w:uiPriority="72" w:unhideWhenUsed="0"/>
-    <w:lsdException w:name="Colorful Grid" w:semiHidden="0" w:uiPriority="73" w:unhideWhenUsed="0"/>
-    <w:lsdException w:name="Light Shading Accent 1" w:semiHidden="0" w:uiPriority="60" w:unhideWhenUsed="0"/>
-    <w:lsdException w:name="Light List Accent 1" w:semiHidden="0" w:uiPriority="61" w:unhideWhenUsed="0"/>
-    <w:lsdException w:name="Light Grid Accent 1" w:semiHidden="0" w:uiPriority="62" w:unhideWhenUsed="0"/>
-    <w:lsdException w:name="Medium Shading 1 Accent 1" w:semiHidden="0" w:uiPriority="63" w:unhideWhenUsed="0"/>
-    <w:lsdException w:name="Medium Shading 2 Accent 1" w:semiHidden="0" w:uiPriority="64" w:unhideWhenUsed="0"/>
-    <w:lsdException w:name="Medium List 1 Accent 1" w:semiHidden="0" w:uiPriority="65" w:unhideWhenUsed="0"/>
-    <w:lsdException w:name="Revision" w:unhideWhenUsed="0"/>
-    <w:lsdException w:name="List Paragraph" w:semiHidden="0" w:uiPriority="34" w:unhideWhenUsed="0" w:qFormat="1"/>
-    <w:lsdException w:name="Quote" w:semiHidden="0" w:uiPriority="29" w:unhideWhenUsed="0" w:qFormat="1"/>
-    <w:lsdException w:name="Intense Quote" w:semiHidden="0" w:uiPriority="30" w:unhideWhenUsed="0" w:qFormat="1"/>
-    <w:lsdException w:name="Medium List 2 Accent 1" w:semiHidden="0" w:uiPriority="66" w:unhideWhenUsed="0"/>
-    <w:lsdException w:name="Medium Grid 1 Accent 1" w:semiHidden="0" w:uiPriority="67" w:unhideWhenUsed="0"/>
-    <w:lsdException w:name="Medium Grid 2 Accent 1" w:semiHidden="0" w:uiPriority="68" w:unhideWhenUsed="0"/>
-    <w:lsdException w:name="Medium Grid 3 Accent 1" w:semiHidden="0" w:uiPriority="69" w:unhideWhenUsed="0"/>
-    <w:lsdException w:name="Dark List Accent 1" w:semiHidden="0" w:uiPriority="70" w:unhideWhenUsed="0"/>
-    <w:lsdException w:name="Colorful Shading Accent 1" w:semiHidden="0" w:uiPriority="71" w:unhideWhenUsed="0"/>
-    <w:lsdException w:name="Colorful List Accent 1" w:semiHidden="0" w:uiPriority="72" w:unhideWhenUsed="0"/>
-    <w:lsdException w:name="Colorful Grid Accent 1" w:semiHidden="0" w:uiPriority="73" w:unhideWhenUsed="0"/>
-    <w:lsdException w:name="Light Shading Accent 2" w:semiHidden="0" w:uiPriority="60" w:unhideWhenUsed="0"/>
-    <w:lsdException w:name="Light List Accent 2" w:semiHidden="0" w:uiPriority="61" w:unhideWhenUsed="0"/>
-    <w:lsdException w:name="Light Grid Accent 2" w:semiHidden="0" w:uiPriority="62" w:unhideWhenUsed="0"/>
-    <w:lsdException w:name="Medium Shading 1 Accent 2" w:semiHidden="0" w:uiPriority="63" w:unhideWhenUsed="0"/>
-    <w:lsdException w:name="Medium Shading 2 Accent 2" w:semiHidden="0" w:uiPriority="64" w:unhideWhenUsed="0"/>
-    <w:lsdException w:name="Medium List 1 Accent 2" w:semiHidden="0" w:uiPriority="65" w:unhideWhenUsed="0"/>
-    <w:lsdException w:name="Medium List 2 Accent 2" w:semiHidden="0" w:uiPriority="66" w:unhideWhenUsed="0"/>
-    <w:lsdException w:name="Medium Grid 1 Accent 2" w:semiHidden="0" w:uiPriority="67" w:unhideWhenUsed="0"/>
-    <w:lsdException w:name="Medium Grid 2 Accent 2" w:semiHidden="0" w:uiPriority="68" w:unhideWhenUsed="0"/>
-    <w:lsdException w:name="Medium Grid 3 Accent 2" w:semiHidden="0" w:uiPriority="69" w:unhideWhenUsed="0"/>
-    <w:lsdException w:name="Dark List Accent 2" w:semiHidden="0" w:uiPriority="70" w:unhideWhenUsed="0"/>
-    <w:lsdException w:name="Colorful Shading Accent 2" w:semiHidden="0" w:uiPriority="71" w:unhideWhenUsed="0"/>
-    <w:lsdException w:name="Colorful List Accent 2" w:semiHidden="0" w:uiPriority="72" w:unhideWhenUsed="0"/>
-    <w:lsdException w:name="Colorful Grid Accent 2" w:semiHidden="0" w:uiPriority="73" w:unhideWhenUsed="0"/>
-    <w:lsdException w:name="Light Shading Accent 3" w:semiHidden="0" w:uiPriority="60" w:unhideWhenUsed="0"/>
-    <w:lsdException w:name="Light List Accent 3" w:semiHidden="0" w:uiPriority="61" w:unhideWhenUsed="0"/>
-    <w:lsdException w:name="Light Grid Accent 3" w:semiHidden="0" w:uiPriority="62" w:unhideWhenUsed="0"/>
-    <w:lsdException w:name="Medium Shading 1 Accent 3" w:semiHidden="0" w:uiPriority="63" w:unhideWhenUsed="0"/>
-    <w:lsdException w:name="Medium Shading 2 Accent 3" w:semiHidden="0" w:uiPriority="64" w:unhideWhenUsed="0"/>
-    <w:lsdException w:name="Medium List 1 Accent 3" w:semiHidden="0" w:uiPriority="65" w:unhideWhenUsed="0"/>
-    <w:lsdException w:name="Medium List 2 Accent 3" w:semiHidden="0" w:uiPriority="66" w:unhideWhenUsed="0"/>
-    <w:lsdException w:name="Medium Grid 1 Accent 3" w:semiHidden="0" w:uiPriority="67" w:unhideWhenUsed="0"/>
-    <w:lsdException w:name="Medium Grid 2 Accent 3" w:semiHidden="0" w:uiPriority="68" w:unhideWhenUsed="0"/>
-    <w:lsdException w:name="Medium Grid 3 Accent 3" w:semiHidden="0" w:uiPriority="69" w:unhideWhenUsed="0"/>
-    <w:lsdException w:name="Dark List Accent 3" w:semiHidden="0" w:uiPriority="70" w:unhideWhenUsed="0"/>
-    <w:lsdException w:name="Colorful Shading Accent 3" w:semiHidden="0" w:uiPriority="71" w:unhideWhenUsed="0"/>
-    <w:lsdException w:name="Colorful List Accent 3" w:semiHidden="0" w:uiPriority="72" w:unhideWhenUsed="0"/>
-    <w:lsdException w:name="Colorful Grid Accent 3" w:semiHidden="0" w:uiPriority="73" w:unhideWhenUsed="0"/>
-    <w:lsdException w:name="Light Shading Accent 4" w:semiHidden="0" w:uiPriority="60" w:unhideWhenUsed="0"/>
-    <w:lsdException w:name="Light List Accent 4" w:semiHidden="0" w:uiPriority="61" w:unhideWhenUsed="0"/>
-    <w:lsdException w:name="Light Grid Accent 4" w:semiHidden="0" w:uiPriority="62" w:unhideWhenUsed="0"/>
-    <w:lsdException w:name="Medium Shading 1 Accent 4" w:semiHidden="0" w:uiPriority="63" w:unhideWhenUsed="0"/>
-    <w:lsdException w:name="Medium Shading 2 Accent 4" w:semiHidden="0" w:uiPriority="64" w:unhideWhenUsed="0"/>
-    <w:lsdException w:name="Medium List 1 Accent 4" w:semiHidden="0" w:uiPriority="65" w:unhideWhenUsed="0"/>
-    <w:lsdException w:name="Medium List 2 Accent 4" w:semiHidden="0" w:uiPriority="66" w:unhideWhenUsed="0"/>
-    <w:lsdException w:name="Medium Grid 1 Accent 4" w:semiHidden="0" w:uiPriority="67" w:unhideWhenUsed="0"/>
-    <w:lsdException w:name="Medium Grid 2 Accent 4" w:semiHidden="0" w:uiPriority="68" w:unhideWhenUsed="0"/>
-    <w:lsdException w:name="Medium Grid 3 Accent 4" w:semiHidden="0" w:uiPriority="69" w:unhideWhenUsed="0"/>
-    <w:lsdException w:name="Dark List Accent 4" w:semiHidden="0" w:uiPriority="70" w:unhideWhenUsed="0"/>
-    <w:lsdException w:name="Colorful Shading Accent 4" w:semiHidden="0" w:uiPriority="71" w:unhideWhenUsed="0"/>
-    <w:lsdException w:name="Colorful List Accent 4" w:semiHidden="0" w:uiPriority="72" w:unhideWhenUsed="0"/>
-    <w:lsdException w:name="Colorful Grid Accent 4" w:semiHidden="0" w:uiPriority="73" w:unhideWhenUsed="0"/>
-    <w:lsdException w:name="Light Shading Accent 5" w:semiHidden="0" w:uiPriority="60" w:unhideWhenUsed="0"/>
-    <w:lsdException w:name="Light List Accent 5" w:semiHidden="0" w:uiPriority="61" w:unhideWhenUsed="0"/>
-    <w:lsdException w:name="Light Grid Accent 5" w:semiHidden="0" w:uiPriority="62" w:unhideWhenUsed="0"/>
-    <w:lsdException w:name="Medium Shading 1 Accent 5" w:semiHidden="0" w:uiPriority="63" w:unhideWhenUsed="0"/>
-    <w:lsdException w:name="Medium Shading 2 Accent 5" w:semiHidden="0" w:uiPriority="64" w:unhideWhenUsed="0"/>
-    <w:lsdException w:name="Medium List 1 Accent 5" w:semiHidden="0" w:uiPriority="65" w:unhideWhenUsed="0"/>
-    <w:lsdException w:name="Medium List 2 Accent 5" w:semiHidden="0" w:uiPriority="66" w:unhideWhenUsed="0"/>
-    <w:lsdException w:name="Medium Grid 1 Accent 5" w:semiHidden="0" w:uiPriority="67" w:unhideWhenUsed="0"/>
-    <w:lsdException w:name="Medium Grid 2 Accent 5" w:semiHidden="0" w:uiPriority="68" w:unhideWhenUsed="0"/>
-    <w:lsdException w:name="Medium Grid 3 Accent 5" w:semiHidden="0" w:uiPriority="69" w:unhideWhenUsed="0"/>
-    <w:lsdException w:name="Dark List Accent 5" w:semiHidden="0" w:uiPriority="70" w:unhideWhenUsed="0"/>
-    <w:lsdException w:name="Colorful Shading Accent 5" w:semiHidden="0" w:uiPriority="71" w:unhideWhenUsed="0"/>
-    <w:lsdException w:name="Colorful List Accent 5" w:semiHidden="0" w:uiPriority="72" w:unhideWhenUsed="0"/>
-    <w:lsdException w:name="Colorful Grid Accent 5" w:semiHidden="0" w:uiPriority="73" w:unhideWhenUsed="0"/>
-    <w:lsdException w:name="Light Shading Accent 6" w:semiHidden="0" w:uiPriority="60" w:unhideWhenUsed="0"/>
-    <w:lsdException w:name="Light List Accent 6" w:semiHidden="0" w:uiPriority="61" w:unhideWhenUsed="0"/>
-    <w:lsdException w:name="Light Grid Accent 6" w:semiHidden="0" w:uiPriority="62" w:unhideWhenUsed="0"/>
-    <w:lsdException w:name="Medium Shading 1 Accent 6" w:semiHidden="0" w:uiPriority="63" w:unhideWhenUsed="0"/>
-    <w:lsdException w:name="Medium Shading 2 Accent 6" w:semiHidden="0" w:uiPriority="64" w:unhideWhenUsed="0"/>
-    <w:lsdException w:name="Medium List 1 Accent 6" w:semiHidden="0" w:uiPriority="65" w:unhideWhenUsed="0"/>
-    <w:lsdException w:name="Medium List 2 Accent 6" w:semiHidden="0" w:uiPriority="66" w:unhideWhenUsed="0"/>
-    <w:lsdException w:name="Medium Grid 1 Accent 6" w:semiHidden="0" w:uiPriority="67" w:unhideWhenUsed="0"/>
-    <w:lsdException w:name="Medium Grid 2 Accent 6" w:semiHidden="0" w:uiPriority="68" w:unhideWhenUsed="0"/>
-    <w:lsdException w:name="Medium Grid 3 Accent 6" w:semiHidden="0" w:uiPriority="69" w:unhideWhenUsed="0"/>
-    <w:lsdException w:name="Dark List Accent 6" w:semiHidden="0" w:uiPriority="70" w:unhideWhenUsed="0"/>
-    <w:lsdException w:name="Colorful Shading Accent 6" w:semiHidden="0" w:uiPriority="71" w:unhideWhenUsed="0"/>
-    <w:lsdException w:name="Colorful List Accent 6" w:semiHidden="0" w:uiPriority="72" w:unhideWhenUsed="0"/>
-    <w:lsdException w:name="Colorful Grid Accent 6" w:semiHidden="0" w:uiPriority="73" w:unhideWhenUsed="0"/>
-    <w:lsdException w:name="Subtle Emphasis" w:semiHidden="0" w:uiPriority="19" w:unhideWhenUsed="0" w:qFormat="1"/>
-    <w:lsdException w:name="Intense Emphasis" w:semiHidden="0" w:uiPriority="21" w:unhideWhenUsed="0" w:qFormat="1"/>
-    <w:lsdException w:name="Subtle Reference" w:semiHidden="0" w:uiPriority="31" w:unhideWhenUsed="0" w:qFormat="1"/>
-    <w:lsdException w:name="Intense Reference" w:semiHidden="0" w:uiPriority="32" w:unhideWhenUsed="0" w:qFormat="1"/>
-    <w:lsdException w:name="Book Title" w:semiHidden="0" w:uiPriority="33" w:unhideWhenUsed="0" w:qFormat="1"/>
-    <w:lsdException w:name="Bibliography" w:uiPriority="37"/>
-    <w:lsdException w:name="TOC Heading" w:uiPriority="39" w:qFormat="1"/>
+  <w:latentStyles w:defLockedState="0" w:defUIPriority="99" w:defSemiHidden="0" w:defUnhideWhenUsed="0" w:defQFormat="0" w:count="376">
+    <w:lsdException w:name="Normal" w:uiPriority="0" w:qFormat="1"/>
+    <w:lsdException w:name="heading 1" w:uiPriority="9" w:qFormat="1"/>
+    <w:lsdException w:name="heading 2" w:semiHidden="1" w:uiPriority="9" w:unhideWhenUsed="1" w:qFormat="1"/>
+    <w:lsdException w:name="heading 3" w:semiHidden="1" w:uiPriority="9" w:unhideWhenUsed="1" w:qFormat="1"/>
+    <w:lsdException w:name="heading 4" w:semiHidden="1" w:uiPriority="9" w:unhideWhenUsed="1" w:qFormat="1"/>
+    <w:lsdException w:name="heading 5" w:semiHidden="1" w:uiPriority="9" w:unhideWhenUsed="1" w:qFormat="1"/>
+    <w:lsdException w:name="heading 6" w:semiHidden="1" w:uiPriority="9" w:unhideWhenUsed="1" w:qFormat="1"/>
+    <w:lsdException w:name="heading 7" w:semiHidden="1" w:uiPriority="9" w:unhideWhenUsed="1" w:qFormat="1"/>
+    <w:lsdException w:name="heading 8" w:semiHidden="1" w:uiPriority="9" w:unhideWhenUsed="1" w:qFormat="1"/>
+    <w:lsdException w:name="heading 9" w:semiHidden="1" w:uiPriority="9" w:unhideWhenUsed="1" w:qFormat="1"/>
+    <w:lsdException w:name="index 1" w:semiHidden="1" w:unhideWhenUsed="1"/>
+    <w:lsdException w:name="index 2" w:semiHidden="1" w:unhideWhenUsed="1"/>
+    <w:lsdException w:name="index 3" w:semiHidden="1" w:unhideWhenUsed="1"/>
+    <w:lsdException w:name="index 4" w:semiHidden="1" w:unhideWhenUsed="1"/>
+    <w:lsdException w:name="index 5" w:semiHidden="1" w:unhideWhenUsed="1"/>
+    <w:lsdException w:name="index 6" w:semiHidden="1" w:unhideWhenUsed="1"/>
+    <w:lsdException w:name="index 7" w:semiHidden="1" w:unhideWhenUsed="1"/>
+    <w:lsdException w:name="index 8" w:semiHidden="1" w:unhideWhenUsed="1"/>
+    <w:lsdException w:name="index 9" w:semiHidden="1" w:unhideWhenUsed="1"/>
+    <w:lsdException w:name="toc 1" w:semiHidden="1" w:uiPriority="39" w:unhideWhenUsed="1"/>
+    <w:lsdException w:name="toc 2" w:semiHidden="1" w:uiPriority="39" w:unhideWhenUsed="1"/>
+    <w:lsdException w:name="toc 3" w:semiHidden="1" w:uiPriority="39" w:unhideWhenUsed="1"/>
+    <w:lsdException w:name="toc 4" w:semiHidden="1" w:uiPriority="39" w:unhideWhenUsed="1"/>
+    <w:lsdException w:name="toc 5" w:semiHidden="1" w:uiPriority="39" w:unhideWhenUsed="1"/>
+    <w:lsdException w:name="toc 6" w:semiHidden="1" w:uiPriority="39" w:unhideWhenUsed="1"/>
+    <w:lsdException w:name="toc 7" w:semiHidden="1" w:uiPriority="39" w:unhideWhenUsed="1"/>
+    <w:lsdException w:name="toc 8" w:semiHidden="1" w:uiPriority="39" w:unhideWhenUsed="1"/>
+    <w:lsdException w:name="toc 9" w:semiHidden="1" w:uiPriority="39" w:unhideWhenUsed="1"/>
+    <w:lsdException w:name="Normal Indent" w:semiHidden="1" w:unhideWhenUsed="1"/>
+    <w:lsdException w:name="footnote text" w:semiHidden="1" w:unhideWhenUsed="1"/>
+    <w:lsdException w:name="annotation text" w:semiHidden="1" w:unhideWhenUsed="1"/>
+    <w:lsdException w:name="header" w:semiHidden="1" w:unhideWhenUsed="1"/>
+    <w:lsdException w:name="footer" w:semiHidden="1" w:unhideWhenUsed="1"/>
+    <w:lsdException w:name="index heading" w:semiHidden="1" w:unhideWhenUsed="1"/>
+    <w:lsdException w:name="caption" w:semiHidden="1" w:uiPriority="35" w:unhideWhenUsed="1" w:qFormat="1"/>
+    <w:lsdException w:name="table of figures" w:semiHidden="1" w:unhideWhenUsed="1"/>
+    <w:lsdException w:name="envelope address" w:semiHidden="1" w:unhideWhenUsed="1"/>
+    <w:lsdException w:name="envelope return" w:semiHidden="1" w:unhideWhenUsed="1"/>
+    <w:lsdException w:name="footnote reference" w:semiHidden="1" w:unhideWhenUsed="1"/>
+    <w:lsdException w:name="annotation reference" w:semiHidden="1" w:unhideWhenUsed="1"/>
+    <w:lsdException w:name="line number" w:semiHidden="1" w:unhideWhenUsed="1"/>
+    <w:lsdException w:name="page number" w:semiHidden="1" w:unhideWhenUsed="1"/>
+    <w:lsdException w:name="endnote reference" w:semiHidden="1" w:unhideWhenUsed="1"/>
+    <w:lsdException w:name="endnote text" w:semiHidden="1" w:unhideWhenUsed="1"/>
+    <w:lsdException w:name="table of authorities" w:semiHidden="1" w:unhideWhenUsed="1"/>
+    <w:lsdException w:name="macro" w:semiHidden="1" w:unhideWhenUsed="1"/>
+    <w:lsdException w:name="toa heading" w:semiHidden="1" w:unhideWhenUsed="1"/>
+    <w:lsdException w:name="List" w:semiHidden="1" w:unhideWhenUsed="1"/>
+    <w:lsdException w:name="List Bullet" w:semiHidden="1" w:unhideWhenUsed="1"/>
+    <w:lsdException w:name="List Number" w:semiHidden="1" w:unhideWhenUsed="1"/>
+    <w:lsdException w:name="List 2" w:semiHidden="1" w:unhideWhenUsed="1"/>
+    <w:lsdException w:name="List 3" w:semiHidden="1" w:unhideWhenUsed="1"/>
+    <w:lsdException w:name="List 4" w:semiHidden="1" w:unhideWhenUsed="1"/>
+    <w:lsdException w:name="List 5" w:semiHidden="1" w:unhideWhenUsed="1"/>
+    <w:lsdException w:name="List Bullet 2" w:semiHidden="1" w:unhideWhenUsed="1"/>
+    <w:lsdException w:name="List Bullet 3" w:semiHidden="1" w:unhideWhenUsed="1"/>
+    <w:lsdException w:name="List Bullet 4" w:semiHidden="1" w:unhideWhenUsed="1"/>
+    <w:lsdException w:name="List Bullet 5" w:semiHidden="1" w:unhideWhenUsed="1"/>
+    <w:lsdException w:name="List Number 2" w:semiHidden="1" w:unhideWhenUsed="1"/>
+    <w:lsdException w:name="List Number 3" w:semiHidden="1" w:unhideWhenUsed="1"/>
+    <w:lsdException w:name="List Number 4" w:semiHidden="1" w:unhideWhenUsed="1"/>
+    <w:lsdException w:name="List Number 5" w:semiHidden="1" w:unhideWhenUsed="1"/>
+    <w:lsdException w:name="Title" w:uiPriority="10" w:qFormat="1"/>
+    <w:lsdException w:name="Closing" w:semiHidden="1" w:unhideWhenUsed="1"/>
+    <w:lsdException w:name="Signature" w:semiHidden="1" w:unhideWhenUsed="1"/>
+    <w:lsdException w:name="Default Paragraph Font" w:semiHidden="1" w:uiPriority="1" w:unhideWhenUsed="1"/>
+    <w:lsdException w:name="Body Text" w:semiHidden="1" w:unhideWhenUsed="1"/>
+    <w:lsdException w:name="Body Text Indent" w:semiHidden="1" w:unhideWhenUsed="1"/>
+    <w:lsdException w:name="List Continue" w:semiHidden="1" w:unhideWhenUsed="1"/>
+    <w:lsdException w:name="List Continue 2" w:semiHidden="1" w:unhideWhenUsed="1"/>
+    <w:lsdException w:name="List Continue 3" w:semiHidden="1" w:unhideWhenUsed="1"/>
+    <w:lsdException w:name="List Continue 4" w:semiHidden="1" w:unhideWhenUsed="1"/>
+    <w:lsdException w:name="List Continue 5" w:semiHidden="1" w:unhideWhenUsed="1"/>
+    <w:lsdException w:name="Message Header" w:semiHidden="1" w:unhideWhenUsed="1"/>
+    <w:lsdException w:name="Subtitle" w:uiPriority="11" w:qFormat="1"/>
+    <w:lsdException w:name="Salutation" w:semiHidden="1" w:unhideWhenUsed="1"/>
+    <w:lsdException w:name="Date" w:semiHidden="1" w:unhideWhenUsed="1"/>
+    <w:lsdException w:name="Body Text First Indent" w:semiHidden="1" w:unhideWhenUsed="1"/>
+    <w:lsdException w:name="Body Text First Indent 2" w:semiHidden="1" w:unhideWhenUsed="1"/>
+    <w:lsdException w:name="Note Heading" w:semiHidden="1" w:unhideWhenUsed="1"/>
+    <w:lsdException w:name="Body Text 2" w:semiHidden="1" w:unhideWhenUsed="1"/>
+    <w:lsdException w:name="Body Text 3" w:semiHidden="1" w:unhideWhenUsed="1"/>
+    <w:lsdException w:name="Body Text Indent 2" w:semiHidden="1" w:unhideWhenUsed="1"/>
+    <w:lsdException w:name="Body Text Indent 3" w:semiHidden="1" w:unhideWhenUsed="1"/>
+    <w:lsdException w:name="Block Text" w:semiHidden="1" w:unhideWhenUsed="1"/>
+    <w:lsdException w:name="Hyperlink" w:semiHidden="1" w:unhideWhenUsed="1"/>
+    <w:lsdException w:name="FollowedHyperlink" w:semiHidden="1" w:unhideWhenUsed="1"/>
+    <w:lsdException w:name="Strong" w:uiPriority="22" w:qFormat="1"/>
+    <w:lsdException w:name="Emphasis" w:uiPriority="20" w:qFormat="1"/>
+    <w:lsdException w:name="Document Map" w:semiHidden="1" w:unhideWhenUsed="1"/>
+    <w:lsdException w:name="Plain Text" w:semiHidden="1" w:unhideWhenUsed="1"/>
+    <w:lsdException w:name="E-mail Signature" w:semiHidden="1" w:unhideWhenUsed="1"/>
+    <w:lsdException w:name="HTML Top of Form" w:semiHidden="1" w:unhideWhenUsed="1"/>
+    <w:lsdException w:name="HTML Bottom of Form" w:semiHidden="1" w:unhideWhenUsed="1"/>
+    <w:lsdException w:name="Normal (Web)" w:semiHidden="1" w:unhideWhenUsed="1"/>
+    <w:lsdException w:name="HTML Acronym" w:semiHidden="1" w:unhideWhenUsed="1"/>
+    <w:lsdException w:name="HTML Address" w:semiHidden="1" w:unhideWhenUsed="1"/>
+    <w:lsdException w:name="HTML Cite" w:semiHidden="1" w:unhideWhenUsed="1"/>
+    <w:lsdException w:name="HTML Code" w:semiHidden="1" w:unhideWhenUsed="1"/>
+    <w:lsdException w:name="HTML Definition" w:semiHidden="1" w:unhideWhenUsed="1"/>
+    <w:lsdException w:name="HTML Keyboard" w:semiHidden="1" w:unhideWhenUsed="1"/>
+    <w:lsdException w:name="HTML Preformatted" w:semiHidden="1" w:unhideWhenUsed="1"/>
+    <w:lsdException w:name="HTML Sample" w:semiHidden="1" w:unhideWhenUsed="1"/>
+    <w:lsdException w:name="HTML Typewriter" w:semiHidden="1" w:unhideWhenUsed="1"/>
+    <w:lsdException w:name="HTML Variable" w:semiHidden="1" w:unhideWhenUsed="1"/>
+    <w:lsdException w:name="Normal Table" w:semiHidden="1" w:unhideWhenUsed="1"/>
+    <w:lsdException w:name="annotation subject" w:semiHidden="1" w:unhideWhenUsed="1"/>
+    <w:lsdException w:name="No List" w:semiHidden="1" w:unhideWhenUsed="1"/>
+    <w:lsdException w:name="Outline List 1" w:semiHidden="1" w:unhideWhenUsed="1"/>
+    <w:lsdException w:name="Outline List 2" w:semiHidden="1" w:unhideWhenUsed="1"/>
+    <w:lsdException w:name="Outline List 3" w:semiHidden="1" w:unhideWhenUsed="1"/>
+    <w:lsdException w:name="Table Simple 1" w:semiHidden="1" w:unhideWhenUsed="1"/>
+    <w:lsdException w:name="Table Simple 2" w:semiHidden="1" w:unhideWhenUsed="1"/>
+    <w:lsdException w:name="Table Simple 3" w:semiHidden="1" w:unhideWhenUsed="1"/>
+    <w:lsdException w:name="Table Classic 1" w:semiHidden="1" w:unhideWhenUsed="1"/>
+    <w:lsdException w:name="Table Classic 2" w:semiHidden="1" w:unhideWhenUsed="1"/>
+    <w:lsdException w:name="Table Classic 3" w:semiHidden="1" w:unhideWhenUsed="1"/>
+    <w:lsdException w:name="Table Classic 4" w:semiHidden="1" w:unhideWhenUsed="1"/>
+    <w:lsdException w:name="Table Colorful 1" w:semiHidden="1" w:unhideWhenUsed="1"/>
+    <w:lsdException w:name="Table Colorful 2" w:semiHidden="1" w:unhideWhenUsed="1"/>
+    <w:lsdException w:name="Table Colorful 3" w:semiHidden="1" w:unhideWhenUsed="1"/>
+    <w:lsdException w:name="Table Columns 1" w:semiHidden="1" w:unhideWhenUsed="1"/>
+    <w:lsdException w:name="Table Columns 2" w:semiHidden="1" w:unhideWhenUsed="1"/>
+    <w:lsdException w:name="Table Columns 3" w:semiHidden="1" w:unhideWhenUsed="1"/>
+    <w:lsdException w:name="Table Columns 4" w:semiHidden="1" w:unhideWhenUsed="1"/>
+    <w:lsdException w:name="Table Columns 5" w:semiHidden="1" w:unhideWhenUsed="1"/>
+    <w:lsdException w:name="Table Grid 1" w:semiHidden="1" w:unhideWhenUsed="1"/>
+    <w:lsdException w:name="Table Grid 2" w:semiHidden="1" w:unhideWhenUsed="1"/>
+    <w:lsdException w:name="Table Grid 3" w:semiHidden="1" w:unhideWhenUsed="1"/>
+    <w:lsdException w:name="Table Grid 4" w:semiHidden="1" w:unhideWhenUsed="1"/>
+    <w:lsdException w:name="Table Grid 5" w:semiHidden="1" w:unhideWhenUsed="1"/>
+    <w:lsdException w:name="Table Grid 6" w:semiHidden="1" w:unhideWhenUsed="1"/>
+    <w:lsdException w:name="Table Grid 7" w:semiHidden="1" w:unhideWhenUsed="1"/>
+    <w:lsdException w:name="Table Grid 8" w:semiHidden="1" w:unhideWhenUsed="1"/>
+    <w:lsdException w:name="Table List 1" w:semiHidden="1" w:unhideWhenUsed="1"/>
+    <w:lsdException w:name="Table List 2" w:semiHidden="1" w:unhideWhenUsed="1"/>
+    <w:lsdException w:name="Table List 3" w:semiHidden="1" w:unhideWhenUsed="1"/>
+    <w:lsdException w:name="Table List 4" w:semiHidden="1" w:unhideWhenUsed="1"/>
+    <w:lsdException w:name="Table List 5" w:semiHidden="1" w:unhideWhenUsed="1"/>
+    <w:lsdException w:name="Table List 6" w:semiHidden="1" w:unhideWhenUsed="1"/>
+    <w:lsdException w:name="Table List 7" w:semiHidden="1" w:unhideWhenUsed="1"/>
+    <w:lsdException w:name="Table List 8" w:semiHidden="1" w:unhideWhenUsed="1"/>
+    <w:lsdException w:name="Table 3D effects 1" w:semiHidden="1" w:unhideWhenUsed="1"/>
+    <w:lsdException w:name="Table 3D effects 2" w:semiHidden="1" w:unhideWhenUsed="1"/>
+    <w:lsdException w:name="Table 3D effects 3" w:semiHidden="1" w:unhideWhenUsed="1"/>
+    <w:lsdException w:name="Table Contemporary" w:semiHidden="1" w:unhideWhenUsed="1"/>
+    <w:lsdException w:name="Table Elegant" w:semiHidden="1" w:unhideWhenUsed="1"/>
+    <w:lsdException w:name="Table Professional" w:semiHidden="1" w:unhideWhenUsed="1"/>
+    <w:lsdException w:name="Table Subtle 1" w:semiHidden="1" w:unhideWhenUsed="1"/>
+    <w:lsdException w:name="Table Subtle 2" w:semiHidden="1" w:unhideWhenUsed="1"/>
+    <w:lsdException w:name="Table Web 1" w:semiHidden="1" w:unhideWhenUsed="1"/>
+    <w:lsdException w:name="Table Web 2" w:semiHidden="1" w:unhideWhenUsed="1"/>
+    <w:lsdException w:name="Table Web 3" w:semiHidden="1" w:unhideWhenUsed="1"/>
+    <w:lsdException w:name="Balloon Text" w:semiHidden="1" w:unhideWhenUsed="1"/>
+    <w:lsdException w:name="Table Grid" w:uiPriority="59"/>
+    <w:lsdException w:name="Table Theme" w:semiHidden="1" w:unhideWhenUsed="1"/>
+    <w:lsdException w:name="Placeholder Text" w:semiHidden="1"/>
+    <w:lsdException w:name="No Spacing" w:uiPriority="1" w:qFormat="1"/>
+    <w:lsdException w:name="Light Shading" w:uiPriority="60"/>
+    <w:lsdException w:name="Light List" w:uiPriority="61"/>
+    <w:lsdException w:name="Light Grid" w:uiPriority="62"/>
+    <w:lsdException w:name="Medium Shading 1" w:uiPriority="63"/>
+    <w:lsdException w:name="Medium Shading 2" w:uiPriority="64"/>
+    <w:lsdException w:name="Medium List 1" w:uiPriority="65"/>
+    <w:lsdException w:name="Medium List 2" w:uiPriority="66"/>
+    <w:lsdException w:name="Medium Grid 1" w:uiPriority="67"/>
+    <w:lsdException w:name="Medium Grid 2" w:uiPriority="68"/>
+    <w:lsdException w:name="Medium Grid 3" w:uiPriority="69"/>
+    <w:lsdException w:name="Dark List" w:uiPriority="70"/>
+    <w:lsdException w:name="Colorful Shading" w:uiPriority="71"/>
+    <w:lsdException w:name="Colorful List" w:uiPriority="72"/>
+    <w:lsdException w:name="Colorful Grid" w:uiPriority="73"/>
+    <w:lsdException w:name="Light Shading Accent 1" w:uiPriority="60"/>
+    <w:lsdException w:name="Light List Accent 1" w:uiPriority="61"/>
+    <w:lsdException w:name="Light Grid Accent 1" w:uiPriority="62"/>
+    <w:lsdException w:name="Medium Shading 1 Accent 1" w:uiPriority="63"/>
+    <w:lsdException w:name="Medium Shading 2 Accent 1" w:uiPriority="64"/>
+    <w:lsdException w:name="Medium List 1 Accent 1" w:uiPriority="65"/>
+    <w:lsdException w:name="Revision" w:semiHidden="1"/>
+    <w:lsdException w:name="List Paragraph" w:uiPriority="34" w:qFormat="1"/>
+    <w:lsdException w:name="Quote" w:uiPriority="29" w:qFormat="1"/>
+    <w:lsdException w:name="Intense Quote" w:uiPriority="30" w:qFormat="1"/>
+    <w:lsdException w:name="Medium List 2 Accent 1" w:uiPriority="66"/>
+    <w:lsdException w:name="Medium Grid 1 Accent 1" w:uiPriority="67"/>
+    <w:lsdException w:name="Medium Grid 2 Accent 1" w:uiPriority="68"/>
+    <w:lsdException w:name="Medium Grid 3 Accent 1" w:uiPriority="69"/>
+    <w:lsdException w:name="Dark List Accent 1" w:uiPriority="70"/>
+    <w:lsdException w:name="Colorful Shading Accent 1" w:uiPriority="71"/>
+    <w:lsdException w:name="Colorful List Accent 1" w:uiPriority="72"/>
+    <w:lsdException w:name="Colorful Grid Accent 1" w:uiPriority="73"/>
+    <w:lsdException w:name="Light Shading Accent 2" w:uiPriority="60"/>
+    <w:lsdException w:name="Light List Accent 2" w:uiPriority="61"/>
+    <w:lsdException w:name="Light Grid Accent 2" w:uiPriority="62"/>
+    <w:lsdException w:name="Medium Shading 1 Accent 2" w:uiPriority="63"/>
+    <w:lsdException w:name="Medium Shading 2 Accent 2" w:uiPriority="64"/>
+    <w:lsdException w:name="Medium List 1 Accent 2" w:uiPriority="65"/>
+    <w:lsdException w:name="Medium List 2 Accent 2" w:uiPriority="66"/>
+    <w:lsdException w:name="Medium Grid 1 Accent 2" w:uiPriority="67"/>
+    <w:lsdException w:name="Medium Grid 2 Accent 2" w:uiPriority="68"/>
+    <w:lsdException w:name="Medium Grid 3 Accent 2" w:uiPriority="69"/>
+    <w:lsdException w:name="Dark List Accent 2" w:uiPriority="70"/>
+    <w:lsdException w:name="Colorful Shading Accent 2" w:uiPriority="71"/>
+    <w:lsdException w:name="Colorful List Accent 2" w:uiPriority="72"/>
+    <w:lsdException w:name="Colorful Grid Accent 2" w:uiPriority="73"/>
+    <w:lsdException w:name="Light Shading Accent 3" w:uiPriority="60"/>
+    <w:lsdException w:name="Light List Accent 3" w:uiPriority="61"/>
+    <w:lsdException w:name="Light Grid Accent 3" w:uiPriority="62"/>
+    <w:lsdException w:name="Medium Shading 1 Accent 3" w:uiPriority="63"/>
+    <w:lsdException w:name="Medium Shading 2 Accent 3" w:uiPriority="64"/>
+    <w:lsdException w:name="Medium List 1 Accent 3" w:uiPriority="65"/>
+    <w:lsdException w:name="Medium List 2 Accent 3" w:uiPriority="66"/>
+    <w:lsdException w:name="Medium Grid 1 Accent 3" w:uiPriority="67"/>
+    <w:lsdException w:name="Medium Grid 2 Accent 3" w:uiPriority="68"/>
+    <w:lsdException w:name="Medium Grid 3 Accent 3" w:uiPriority="69"/>
+    <w:lsdException w:name="Dark List Accent 3" w:uiPriority="70"/>
+    <w:lsdException w:name="Colorful Shading Accent 3" w:uiPriority="71"/>
+    <w:lsdException w:name="Colorful List Accent 3" w:uiPriority="72"/>
+    <w:lsdException w:name="Colorful Grid Accent 3" w:uiPriority="73"/>
+    <w:lsdException w:name="Light Shading Accent 4" w:uiPriority="60"/>
+    <w:lsdException w:name="Light List Accent 4" w:uiPriority="61"/>
+    <w:lsdException w:name="Light Grid Accent 4" w:uiPriority="62"/>
+    <w:lsdException w:name="Medium Shading 1 Accent 4" w:uiPriority="63"/>
+    <w:lsdException w:name="Medium Shading 2 Accent 4" w:uiPriority="64"/>
+    <w:lsdException w:name="Medium List 1 Accent 4" w:uiPriority="65"/>
+    <w:lsdException w:name="Medium List 2 Accent 4" w:uiPriority="66"/>
+    <w:lsdException w:name="Medium Grid 1 Accent 4" w:uiPriority="67"/>
+    <w:lsdException w:name="Medium Grid 2 Accent 4" w:uiPriority="68"/>
+    <w:lsdException w:name="Medium Grid 3 Accent 4" w:uiPriority="69"/>
+    <w:lsdException w:name="Dark List Accent 4" w:uiPriority="70"/>
+    <w:lsdException w:name="Colorful Shading Accent 4" w:uiPriority="71"/>
+    <w:lsdException w:name="Colorful List Accent 4" w:uiPriority="72"/>
+    <w:lsdException w:name="Colorful Grid Accent 4" w:uiPriority="73"/>
+    <w:lsdException w:name="Light Shading Accent 5" w:uiPriority="60"/>
+    <w:lsdException w:name="Light List Accent 5" w:uiPriority="61"/>
+    <w:lsdException w:name="Light Grid Accent 5" w:uiPriority="62"/>
+    <w:lsdException w:name="Medium Shading 1 Accent 5" w:uiPriority="63"/>
+    <w:lsdException w:name="Medium Shading 2 Accent 5" w:uiPriority="64"/>
+    <w:lsdException w:name="Medium List 1 Accent 5" w:uiPriority="65"/>
+    <w:lsdException w:name="Medium List 2 Accent 5" w:uiPriority="66"/>
+    <w:lsdException w:name="Medium Grid 1 Accent 5" w:uiPriority="67"/>
+    <w:lsdException w:name="Medium Grid 2 Accent 5" w:uiPriority="68"/>
+    <w:lsdException w:name="Medium Grid 3 Accent 5" w:uiPriority="69"/>
+    <w:lsdException w:name="Dark List Accent 5" w:uiPriority="70"/>
+    <w:lsdException w:name="Colorful Shading Accent 5" w:uiPriority="71"/>
+    <w:lsdException w:name="Colorful List Accent 5" w:uiPriority="72"/>
+    <w:lsdException w:name="Colorful Grid Accent 5" w:uiPriority="73"/>
+    <w:lsdException w:name="Light Shading Accent 6" w:uiPriority="60"/>
+    <w:lsdException w:name="Light List Accent 6" w:uiPriority="61"/>
+    <w:lsdException w:name="Light Grid Accent 6" w:uiPriority="62"/>
+    <w:lsdException w:name="Medium Shading 1 Accent 6" w:uiPriority="63"/>
+    <w:lsdException w:name="Medium Shading 2 Accent 6" w:uiPriority="64"/>
+    <w:lsdException w:name="Medium List 1 Accent 6" w:uiPriority="65"/>
+    <w:lsdException w:name="Medium List 2 Accent 6" w:uiPriority="66"/>
+    <w:lsdException w:name="Medium Grid 1 Accent 6" w:uiPriority="67"/>
+    <w:lsdException w:name="Medium Grid 2 Accent 6" w:uiPriority="68"/>
+    <w:lsdException w:name="Medium Grid 3 Accent 6" w:uiPriority="69"/>
+    <w:lsdException w:name="Dark List Accent 6" w:uiPriority="70"/>
+    <w:lsdException w:name="Colorful Shading Accent 6" w:uiPriority="71"/>
+    <w:lsdException w:name="Colorful List Accent 6" w:uiPriority="72"/>
+    <w:lsdException w:name="Colorful Grid Accent 6" w:uiPriority="73"/>
+    <w:lsdException w:name="Subtle Emphasis" w:uiPriority="19" w:qFormat="1"/>
+    <w:lsdException w:name="Intense Emphasis" w:uiPriority="21" w:qFormat="1"/>
+    <w:lsdException w:name="Subtle Reference" w:uiPriority="31" w:qFormat="1"/>
+    <w:lsdException w:name="Intense Reference" w:uiPriority="32" w:qFormat="1"/>
+    <w:lsdException w:name="Book Title" w:uiPriority="33" w:qFormat="1"/>
+    <w:lsdException w:name="Bibliography" w:semiHidden="1" w:uiPriority="37" w:unhideWhenUsed="1"/>
+    <w:lsdException w:name="TOC Heading" w:semiHidden="1" w:uiPriority="39" w:unhideWhenUsed="1" w:qFormat="1"/>
+    <w:lsdException w:name="Plain Table 1" w:uiPriority="41"/>
+    <w:lsdException w:name="Plain Table 2" w:uiPriority="42"/>
+    <w:lsdException w:name="Plain Table 3" w:uiPriority="43"/>
+    <w:lsdException w:name="Plain Table 4" w:uiPriority="44"/>
+    <w:lsdException w:name="Plain Table 5" w:uiPriority="45"/>
+    <w:lsdException w:name="Grid Table Light" w:uiPriority="40"/>
+    <w:lsdException w:name="Grid Table 1 Light" w:uiPriority="46"/>
+    <w:lsdException w:name="Grid Table 2" w:uiPriority="47"/>
+    <w:lsdException w:name="Grid Table 3" w:uiPriority="48"/>
+    <w:lsdException w:name="Grid Table 4" w:uiPriority="49"/>
+    <w:lsdException w:name="Grid Table 5 Dark" w:uiPriority="50"/>
+    <w:lsdException w:name="Grid Table 6 Colorful" w:uiPriority="51"/>
+    <w:lsdException w:name="Grid Table 7 Colorful" w:uiPriority="52"/>
+    <w:lsdException w:name="Grid Table 1 Light Accent 1" w:uiPriority="46"/>
+    <w:lsdException w:name="Grid Table 2 Accent 1" w:uiPriority="47"/>
+    <w:lsdException w:name="Grid Table 3 Accent 1" w:uiPriority="48"/>
+    <w:lsdException w:name="Grid Table 4 Accent 1" w:uiPriority="49"/>
+    <w:lsdException w:name="Grid Table 5 Dark Accent 1" w:uiPriority="50"/>
+    <w:lsdException w:name="Grid Table 6 Colorful Accent 1" w:uiPriority="51"/>
+    <w:lsdException w:name="Grid Table 7 Colorful Accent 1" w:uiPriority="52"/>
+    <w:lsdException w:name="Grid Table 1 Light Accent 2" w:uiPriority="46"/>
+    <w:lsdException w:name="Grid Table 2 Accent 2" w:uiPriority="47"/>
+    <w:lsdException w:name="Grid Table 3 Accent 2" w:uiPriority="48"/>
+    <w:lsdException w:name="Grid Table 4 Accent 2" w:uiPriority="49"/>
+    <w:lsdException w:name="Grid Table 5 Dark Accent 2" w:uiPriority="50"/>
+    <w:lsdException w:name="Grid Table 6 Colorful Accent 2" w:uiPriority="51"/>
+    <w:lsdException w:name="Grid Table 7 Colorful Accent 2" w:uiPriority="52"/>
+    <w:lsdException w:name="Grid Table 1 Light Accent 3" w:uiPriority="46"/>
+    <w:lsdException w:name="Grid Table 2 Accent 3" w:uiPriority="47"/>
+    <w:lsdException w:name="Grid Table 3 Accent 3" w:uiPriority="48"/>
+    <w:lsdException w:name="Grid Table 4 Accent 3" w:uiPriority="49"/>
+    <w:lsdException w:name="Grid Table 5 Dark Accent 3" w:uiPriority="50"/>
+    <w:lsdException w:name="Grid Table 6 Colorful Accent 3" w:uiPriority="51"/>
+    <w:lsdException w:name="Grid Table 7 Colorful Accent 3" w:uiPriority="52"/>
+    <w:lsdException w:name="Grid Table 1 Light Accent 4" w:uiPriority="46"/>
+    <w:lsdException w:name="Grid Table 2 Accent 4" w:uiPriority="47"/>
+    <w:lsdException w:name="Grid Table 3 Accent 4" w:uiPriority="48"/>
+    <w:lsdException w:name="Grid Table 4 Accent 4" w:uiPriority="49"/>
+    <w:lsdException w:name="Grid Table 5 Dark Accent 4" w:uiPriority="50"/>
+    <w:lsdException w:name="Grid Table 6 Colorful Accent 4" w:uiPriority="51"/>
+    <w:lsdException w:name="Grid Table 7 Colorful Accent 4" w:uiPriority="52"/>
+    <w:lsdException w:name="Grid Table 1 Light Accent 5" w:uiPriority="46"/>
+    <w:lsdException w:name="Grid Table 2 Accent 5" w:uiPriority="47"/>
+    <w:lsdException w:name="Grid Table 3 Accent 5" w:uiPriority="48"/>
+    <w:lsdException w:name="Grid Table 4 Accent 5" w:uiPriority="49"/>
+    <w:lsdException w:name="Grid Table 5 Dark Accent 5" w:uiPriority="50"/>
+    <w:lsdException w:name="Grid Table 6 Colorful Accent 5" w:uiPriority="51"/>
+    <w:lsdException w:name="Grid Table 7 Colorful Accent 5" w:uiPriority="52"/>
+    <w:lsdException w:name="Grid Table 1 Light Accent 6" w:uiPriority="46"/>
+    <w:lsdException w:name="Grid Table 2 Accent 6" w:uiPriority="47"/>
+    <w:lsdException w:name="Grid Table 3 Accent 6" w:uiPriority="48"/>
+    <w:lsdException w:name="Grid Table 4 Accent 6" w:uiPriority="49"/>
+    <w:lsdException w:name="Grid Table 5 Dark Accent 6" w:uiPriority="50"/>
+    <w:lsdException w:name="Grid Table 6 Colorful Accent 6" w:uiPriority="51"/>
+    <w:lsdException w:name="Grid Table 7 Colorful Accent 6" w:uiPriority="52"/>
+    <w:lsdException w:name="List Table 1 Light" w:uiPriority="46"/>
+    <w:lsdException w:name="List Table 2" w:uiPriority="47"/>
+    <w:lsdException w:name="List Table 3" w:uiPriority="48"/>
+    <w:lsdException w:name="List Table 4" w:uiPriority="49"/>
+    <w:lsdException w:name="List Table 5 Dark" w:uiPriority="50"/>
+    <w:lsdException w:name="List Table 6 Colorful" w:uiPriority="51"/>
+    <w:lsdException w:name="List Table 7 Colorful" w:uiPriority="52"/>
+    <w:lsdException w:name="List Table 1 Light Accent 1" w:uiPriority="46"/>
+    <w:lsdException w:name="List Table 2 Accent 1" w:uiPriority="47"/>
+    <w:lsdException w:name="List Table 3 Accent 1" w:uiPriority="48"/>
+    <w:lsdException w:name="List Table 4 Accent 1" w:uiPriority="49"/>
+    <w:lsdException w:name="List Table 5 Dark Accent 1" w:uiPriority="50"/>
+    <w:lsdException w:name="List Table 6 Colorful Accent 1" w:uiPriority="51"/>
+    <w:lsdException w:name="List Table 7 Colorful Accent 1" w:uiPriority="52"/>
+    <w:lsdException w:name="List Table 1 Light Accent 2" w:uiPriority="46"/>
+    <w:lsdException w:name="List Table 2 Accent 2" w:uiPriority="47"/>
+    <w:lsdException w:name="List Table 3 Accent 2" w:uiPriority="48"/>
+    <w:lsdException w:name="List Table 4 Accent 2" w:uiPriority="49"/>
+    <w:lsdException w:name="List Table 5 Dark Accent 2" w:uiPriority="50"/>
+    <w:lsdException w:name="List Table 6 Colorful Accent 2" w:uiPriority="51"/>
+    <w:lsdException w:name="List Table 7 Colorful Accent 2" w:uiPriority="52"/>
+    <w:lsdException w:name="List Table 1 Light Accent 3" w:uiPriority="46"/>
+    <w:lsdException w:name="List Table 2 Accent 3" w:uiPriority="47"/>
+    <w:lsdException w:name="List Table 3 Accent 3" w:uiPriority="48"/>
+    <w:lsdException w:name="List Table 4 Accent 3" w:uiPriority="49"/>
+    <w:lsdException w:name="List Table 5 Dark Accent 3" w:uiPriority="50"/>
+    <w:lsdException w:name="List Table 6 Colorful Accent 3" w:uiPriority="51"/>
+    <w:lsdException w:name="List Table 7 Colorful Accent 3" w:uiPriority="52"/>
+    <w:lsdException w:name="List Table 1 Light Accent 4" w:uiPriority="46"/>
+    <w:lsdException w:name="List Table 2 Accent 4" w:uiPriority="47"/>
+    <w:lsdException w:name="List Table 3 Accent 4" w:uiPriority="48"/>
+    <w:lsdException w:name="List Table 4 Accent 4" w:uiPriority="49"/>
+    <w:lsdException w:name="List Table 5 Dark Accent 4" w:uiPriority="50"/>
+    <w:lsdException w:name="List Table 6 Colorful Accent 4" w:uiPriority="51"/>
+    <w:lsdException w:name="List Table 7 Colorful Accent 4" w:uiPriority="52"/>
+    <w:lsdException w:name="List Table 1 Light Accent 5" w:uiPriority="46"/>
+    <w:lsdException w:name="List Table 2 Accent 5" w:uiPriority="47"/>
+    <w:lsdException w:name="List Table 3 Accent 5" w:uiPriority="48"/>
+    <w:lsdException w:name="List Table 4 Accent 5" w:uiPriority="49"/>
+    <w:lsdException w:name="List Table 5 Dark Accent 5" w:uiPriority="50"/>
+    <w:lsdException w:name="List Table 6 Colorful Accent 5" w:uiPriority="51"/>
+    <w:lsdException w:name="List Table 7 Colorful Accent 5" w:uiPriority="52"/>
+    <w:lsdException w:name="List Table 1 Light Accent 6" w:uiPriority="46"/>
+    <w:lsdException w:name="List Table 2 Accent 6" w:uiPriority="47"/>
+    <w:lsdException w:name="List Table 3 Accent 6" w:uiPriority="48"/>
+    <w:lsdException w:name="List Table 4 Accent 6" w:uiPriority="49"/>
+    <w:lsdException w:name="List Table 5 Dark Accent 6" w:uiPriority="50"/>
+    <w:lsdException w:name="List Table 6 Colorful Accent 6" w:uiPriority="51"/>
+    <w:lsdException w:name="List Table 7 Colorful Accent 6" w:uiPriority="52"/>
+    <w:lsdException w:name="Mention" w:semiHidden="1" w:unhideWhenUsed="1"/>
+    <w:lsdException w:name="Smart Hyperlink" w:semiHidden="1" w:unhideWhenUsed="1"/>
+    <w:lsdException w:name="Hashtag" w:semiHidden="1" w:unhideWhenUsed="1"/>
+    <w:lsdException w:name="Unresolved Mention" w:semiHidden="1" w:unhideWhenUsed="1"/>
+    <w:lsdException w:name="Smart Link" w:semiHidden="1" w:unhideWhenUsed="1"/>
   </w:latentStyles>
   <w:style w:type="paragraph" w:default="1" w:styleId="Normal">
     <w:name w:val="Normal"/>
@@ -1155,7 +2794,6 @@
     <w:uiPriority w:val="99"/>
     <w:semiHidden/>
     <w:unhideWhenUsed/>
-    <w:qFormat/>
     <w:tblPr>
       <w:tblInd w:w="0" w:type="dxa"/>
       <w:tblCellMar>
@@ -1237,6 +2875,19 @@
     <w:rPr>
       <w:b/>
       <w:bCs/>
+    </w:rPr>
+  </w:style>
+  <w:style w:type="character" w:styleId="HTMLCode">
+    <w:name w:val="HTML Code"/>
+    <w:basedOn w:val="DefaultParagraphFont"/>
+    <w:uiPriority w:val="99"/>
+    <w:semiHidden/>
+    <w:unhideWhenUsed/>
+    <w:rsid w:val="001B4E63"/>
+    <w:rPr>
+      <w:rFonts w:ascii="Courier New" w:eastAsia="Times New Roman" w:hAnsi="Courier New" w:cs="Courier New"/>
+      <w:sz w:val="20"/>
+      <w:szCs w:val="20"/>
     </w:rPr>
   </w:style>
 </w:styles>

</xml_diff>

<commit_message>
update readme for git pull
</commit_message>
<xml_diff>
--- a/README.docx
+++ b/README.docx
@@ -143,7 +143,7 @@
           <w:sz w:val="24"/>
           <w:szCs w:val="24"/>
         </w:rPr>
-        <w:pict w14:anchorId="7D88022B">
+        <w:pict w14:anchorId="298A1B47">
           <v:rect id="_x0000_i1028" alt="" style="width:468pt;height:.05pt;mso-width-percent:0;mso-height-percent:0;mso-width-percent:0;mso-height-percent:0" o:hralign="center" o:hrstd="t" o:hr="t" fillcolor="#a0a0a0" stroked="f"/>
         </w:pict>
       </w:r>
@@ -346,7 +346,7 @@
           <w:sz w:val="24"/>
           <w:szCs w:val="24"/>
         </w:rPr>
-        <w:pict w14:anchorId="2171D06E">
+        <w:pict w14:anchorId="1EB1E25F">
           <v:rect id="_x0000_i1027" alt="" style="width:468pt;height:.05pt;mso-width-percent:0;mso-height-percent:0;mso-width-percent:0;mso-height-percent:0" o:hralign="center" o:hrstd="t" o:hr="t" fillcolor="#a0a0a0" stroked="f"/>
         </w:pict>
       </w:r>
@@ -567,7 +567,7 @@
           <w:sz w:val="24"/>
           <w:szCs w:val="24"/>
         </w:rPr>
-        <w:pict w14:anchorId="589636B5">
+        <w:pict w14:anchorId="7EEC2925">
           <v:rect id="_x0000_i1026" alt="" style="width:468pt;height:.05pt;mso-width-percent:0;mso-height-percent:0;mso-width-percent:0;mso-height-percent:0" o:hralign="center" o:hrstd="t" o:hr="t" fillcolor="#a0a0a0" stroked="f"/>
         </w:pict>
       </w:r>
@@ -1228,7 +1228,7 @@
           <w:sz w:val="24"/>
           <w:szCs w:val="24"/>
         </w:rPr>
-        <w:pict w14:anchorId="2744DB23">
+        <w:pict w14:anchorId="334C8B5C">
           <v:rect id="_x0000_i1025" alt="" style="width:468pt;height:.05pt;mso-width-percent:0;mso-height-percent:0;mso-width-percent:0;mso-height-percent:0" o:hralign="center" o:hrstd="t" o:hr="t" fillcolor="#a0a0a0" stroked="f"/>
         </w:pict>
       </w:r>
@@ -1293,25 +1293,49 @@
           <w:sz w:val="21"/>
           <w:szCs w:val="21"/>
         </w:rPr>
-        <w:t>Open </w:t>
-      </w:r>
-      <w:r>
-        <w:rPr>
-          <w:rFonts w:ascii="Segoe UI" w:eastAsia="Times New Roman" w:hAnsi="Segoe UI" w:cs="Segoe UI"/>
-          <w:b/>
-          <w:bCs/>
-          <w:sz w:val="21"/>
-          <w:szCs w:val="21"/>
-        </w:rPr>
-        <w:t>Git Bash</w:t>
-      </w:r>
-      <w:r>
-        <w:rPr>
-          <w:rFonts w:ascii="Segoe UI" w:eastAsia="Times New Roman" w:hAnsi="Segoe UI" w:cs="Segoe UI"/>
-          <w:sz w:val="21"/>
-          <w:szCs w:val="21"/>
-        </w:rPr>
-        <w:t>.</w:t>
+        <w:t>Go to Schooldays folder</w:t>
+      </w:r>
+      <w:r>
+        <w:rPr>
+          <w:rFonts w:ascii="Segoe UI" w:eastAsia="Times New Roman" w:hAnsi="Segoe UI" w:cs="Segoe UI"/>
+          <w:sz w:val="21"/>
+          <w:szCs w:val="21"/>
+        </w:rPr>
+        <w:drawing>
+          <wp:inline distT="0" distB="0" distL="0" distR="0" wp14:anchorId="4207C07B" wp14:editId="6E3A7648">
+            <wp:extent cx="5943600" cy="3086100"/>
+            <wp:effectExtent l="0" t="0" r="0" b="0"/>
+            <wp:docPr id="1188156585" name="Picture 1" descr="A screenshot of a computer&#10;&#10;AI-generated content may be incorrect."/>
+            <wp:cNvGraphicFramePr>
+              <a:graphicFrameLocks xmlns:a="http://schemas.openxmlformats.org/drawingml/2006/main" noChangeAspect="1"/>
+            </wp:cNvGraphicFramePr>
+            <a:graphic xmlns:a="http://schemas.openxmlformats.org/drawingml/2006/main">
+              <a:graphicData uri="http://schemas.openxmlformats.org/drawingml/2006/picture">
+                <pic:pic xmlns:pic="http://schemas.openxmlformats.org/drawingml/2006/picture">
+                  <pic:nvPicPr>
+                    <pic:cNvPr id="1188156585" name="Picture 1" descr="A screenshot of a computer&#10;&#10;AI-generated content may be incorrect."/>
+                    <pic:cNvPicPr/>
+                  </pic:nvPicPr>
+                  <pic:blipFill>
+                    <a:blip r:embed="rId5"/>
+                    <a:stretch>
+                      <a:fillRect/>
+                    </a:stretch>
+                  </pic:blipFill>
+                  <pic:spPr>
+                    <a:xfrm>
+                      <a:off x="0" y="0"/>
+                      <a:ext cx="5943600" cy="3086100"/>
+                    </a:xfrm>
+                    <a:prstGeom prst="rect">
+                      <a:avLst/>
+                    </a:prstGeom>
+                  </pic:spPr>
+                </pic:pic>
+              </a:graphicData>
+            </a:graphic>
+          </wp:inline>
+        </w:drawing>
       </w:r>
     </w:p>
     <w:p>
@@ -1333,41 +1357,7 @@
           <w:sz w:val="21"/>
           <w:szCs w:val="21"/>
         </w:rPr>
-        <w:t>Go to this project folder (the one that contains </w:t>
-      </w:r>
-      <w:r>
-        <w:rPr>
-          <w:rFonts w:ascii="Menlo" w:eastAsia="Times New Roman" w:hAnsi="Menlo" w:cs="Menlo"/>
-          <w:color w:val="88C0D0"/>
-          <w:sz w:val="21"/>
-          <w:szCs w:val="21"/>
-        </w:rPr>
-        <w:t>yearbook-choice</w:t>
-      </w:r>
-      <w:r>
-        <w:rPr>
-          <w:rFonts w:ascii="Segoe UI" w:eastAsia="Times New Roman" w:hAnsi="Segoe UI" w:cs="Segoe UI"/>
-          <w:sz w:val="21"/>
-          <w:szCs w:val="21"/>
-        </w:rPr>
-        <w:t> and </w:t>
-      </w:r>
-      <w:r>
-        <w:rPr>
-          <w:rFonts w:ascii="Menlo" w:eastAsia="Times New Roman" w:hAnsi="Menlo" w:cs="Menlo"/>
-          <w:color w:val="88C0D0"/>
-          <w:sz w:val="21"/>
-          <w:szCs w:val="21"/>
-        </w:rPr>
-        <w:t>package-choice</w:t>
-      </w:r>
-      <w:r>
-        <w:rPr>
-          <w:rFonts w:ascii="Segoe UI" w:eastAsia="Times New Roman" w:hAnsi="Segoe UI" w:cs="Segoe UI"/>
-          <w:sz w:val="21"/>
-          <w:szCs w:val="21"/>
-        </w:rPr>
-        <w:t>).</w:t>
+        <w:t>Right click inside of the folder</w:t>
       </w:r>
     </w:p>
     <w:p>
@@ -1389,7 +1379,55 @@
           <w:sz w:val="21"/>
           <w:szCs w:val="21"/>
         </w:rPr>
-        <w:t>Run: </w:t>
+        <w:t>Open </w:t>
+      </w:r>
+      <w:r>
+        <w:rPr>
+          <w:rFonts w:ascii="Segoe UI" w:eastAsia="Times New Roman" w:hAnsi="Segoe UI" w:cs="Segoe UI"/>
+          <w:b/>
+          <w:bCs/>
+          <w:sz w:val="21"/>
+          <w:szCs w:val="21"/>
+        </w:rPr>
+        <w:t>Git Bash</w:t>
+      </w:r>
+      <w:r>
+        <w:rPr>
+          <w:rFonts w:ascii="Segoe UI" w:eastAsia="Times New Roman" w:hAnsi="Segoe UI" w:cs="Segoe UI"/>
+          <w:sz w:val="21"/>
+          <w:szCs w:val="21"/>
+        </w:rPr>
+        <w:t xml:space="preserve"> </w:t>
+      </w:r>
+    </w:p>
+    <w:p>
+      <w:pPr>
+        <w:numPr>
+          <w:ilvl w:val="0"/>
+          <w:numId w:val="7"/>
+        </w:numPr>
+        <w:spacing w:before="100" w:beforeAutospacing="1" w:after="100" w:afterAutospacing="1" w:line="240" w:lineRule="auto"/>
+        <w:rPr>
+          <w:rFonts w:ascii="Segoe UI" w:eastAsia="Times New Roman" w:hAnsi="Segoe UI" w:cs="Segoe UI"/>
+          <w:sz w:val="21"/>
+          <w:szCs w:val="21"/>
+        </w:rPr>
+      </w:pPr>
+      <w:r>
+        <w:rPr>
+          <w:rFonts w:ascii="Segoe UI" w:eastAsia="Times New Roman" w:hAnsi="Segoe UI" w:cs="Segoe UI"/>
+          <w:sz w:val="21"/>
+          <w:szCs w:val="21"/>
+        </w:rPr>
+        <w:t>Tyoe</w:t>
+      </w:r>
+      <w:r>
+        <w:rPr>
+          <w:rFonts w:ascii="Segoe UI" w:eastAsia="Times New Roman" w:hAnsi="Segoe UI" w:cs="Segoe UI"/>
+          <w:sz w:val="21"/>
+          <w:szCs w:val="21"/>
+        </w:rPr>
+        <w:t>: </w:t>
       </w:r>
       <w:r>
         <w:rPr>
@@ -1405,6 +1443,28 @@
     </w:p>
     <w:p>
       <w:pPr>
+        <w:numPr>
+          <w:ilvl w:val="0"/>
+          <w:numId w:val="7"/>
+        </w:numPr>
+        <w:spacing w:before="100" w:beforeAutospacing="1" w:after="100" w:afterAutospacing="1" w:line="240" w:lineRule="auto"/>
+        <w:rPr>
+          <w:rFonts w:ascii="Segoe UI" w:eastAsia="Times New Roman" w:hAnsi="Segoe UI" w:cs="Segoe UI"/>
+          <w:sz w:val="21"/>
+          <w:szCs w:val="21"/>
+        </w:rPr>
+      </w:pPr>
+      <w:r>
+        <w:rPr>
+          <w:rFonts w:ascii="Segoe UI" w:eastAsia="Times New Roman" w:hAnsi="Segoe UI" w:cs="Segoe UI"/>
+          <w:sz w:val="21"/>
+          <w:szCs w:val="21"/>
+        </w:rPr>
+        <w:t>Ensure files have been updated</w:t>
+      </w:r>
+    </w:p>
+    <w:p>
+      <w:pPr>
         <w:spacing w:after="240" w:line="240" w:lineRule="auto"/>
         <w:rPr>
           <w:rFonts w:ascii="Segoe UI" w:eastAsia="Times New Roman" w:hAnsi="Segoe UI" w:cs="Segoe UI"/>
@@ -1418,6 +1478,7 @@
           <w:sz w:val="21"/>
           <w:szCs w:val="21"/>
         </w:rPr>
+        <w:lastRenderedPageBreak/>
         <w:t>That’s it. You’ll then have the latest instructions and fixes.</w:t>
       </w:r>
     </w:p>

</xml_diff>